<commit_message>
Correcion 01 - hasta zabala Gonzalo OK
</commit_message>
<xml_diff>
--- a/Practicos/Notas y Devoluciones 01.docx
+++ b/Practicos/Notas y Devoluciones 01.docx
@@ -34,7 +34,6 @@
           <w:rFonts w:ascii="Segoe UI Emoji" w:hAnsi="Segoe UI Emoji" w:cs="Segoe UI Emoji"/>
         </w:rPr>
       </w:pPr>
-      <w:proofErr w:type="gramStart"/>
       <w:r>
         <w:rPr>
           <w:rFonts w:ascii="Segoe UI Emoji" w:hAnsi="Segoe UI Emoji" w:cs="Segoe UI Emoji"/>
@@ -42,11 +41,7 @@
         <w:t>🎉</w:t>
       </w:r>
       <w:r>
-        <w:t>¡</w:t>
-      </w:r>
-      <w:proofErr w:type="gramEnd"/>
-      <w:r>
-        <w:t>Felicitaciones por la entrega del</w:t>
+        <w:t>¡Felicitaciones por la entrega del</w:t>
       </w:r>
       <w:r>
         <w:t xml:space="preserve"> Desafío </w:t>
@@ -173,7 +168,6 @@
           <w:rFonts w:ascii="Segoe UI Emoji" w:hAnsi="Segoe UI Emoji" w:cs="Segoe UI Emoji"/>
         </w:rPr>
       </w:pPr>
-      <w:proofErr w:type="gramStart"/>
       <w:r>
         <w:rPr>
           <w:rFonts w:ascii="Segoe UI Emoji" w:hAnsi="Segoe UI Emoji" w:cs="Segoe UI Emoji"/>
@@ -181,11 +175,7 @@
         <w:t>🎉</w:t>
       </w:r>
       <w:r>
-        <w:t>¡</w:t>
-      </w:r>
-      <w:proofErr w:type="gramEnd"/>
-      <w:r>
-        <w:t xml:space="preserve">Felicitaciones por la entrega del Desafío 01! </w:t>
+        <w:t xml:space="preserve">¡Felicitaciones por la entrega del Desafío 01! </w:t>
       </w:r>
       <w:r>
         <w:rPr>
@@ -308,7 +298,6 @@
           <w:rFonts w:ascii="Segoe UI Emoji" w:hAnsi="Segoe UI Emoji" w:cs="Segoe UI Emoji"/>
         </w:rPr>
       </w:pPr>
-      <w:proofErr w:type="gramStart"/>
       <w:r>
         <w:rPr>
           <w:rFonts w:ascii="Segoe UI Emoji" w:hAnsi="Segoe UI Emoji" w:cs="Segoe UI Emoji"/>
@@ -316,11 +305,7 @@
         <w:t>🎉</w:t>
       </w:r>
       <w:r>
-        <w:t>¡</w:t>
-      </w:r>
-      <w:proofErr w:type="gramEnd"/>
-      <w:r>
-        <w:t xml:space="preserve">Felicitaciones por la entrega del Desafío 01! </w:t>
+        <w:t xml:space="preserve">¡Felicitaciones por la entrega del Desafío 01! </w:t>
       </w:r>
       <w:r>
         <w:rPr>
@@ -440,15 +425,7 @@
       </w:r>
       <w:proofErr w:type="spellEnd"/>
       <w:r>
-        <w:t xml:space="preserve">&gt;&lt;b&gt;HTML, CSS y JavaScript:&lt;/b&gt; fundamentos del desarrollo </w:t>
-      </w:r>
-      <w:proofErr w:type="gramStart"/>
-      <w:r>
-        <w:t>web.&lt;</w:t>
-      </w:r>
-      <w:proofErr w:type="gramEnd"/>
-      <w:r>
-        <w:t>/</w:t>
+        <w:t>&gt;&lt;b&gt;HTML, CSS y JavaScript:&lt;/b&gt; fundamentos del desarrollo web.&lt;/</w:t>
       </w:r>
       <w:proofErr w:type="spellStart"/>
       <w:r>
@@ -483,15 +460,7 @@
       </w:r>
       <w:proofErr w:type="spellEnd"/>
       <w:r>
-        <w:t xml:space="preserve">&gt;&lt;b&gt;Control de versiones:&lt;/b&gt; Git y </w:t>
-      </w:r>
-      <w:proofErr w:type="gramStart"/>
-      <w:r>
-        <w:t>GitHub.&lt;</w:t>
-      </w:r>
-      <w:proofErr w:type="gramEnd"/>
-      <w:r>
-        <w:t>/</w:t>
+        <w:t>&gt;&lt;b&gt;Control de versiones:&lt;/b&gt; Git y GitHub.&lt;/</w:t>
       </w:r>
       <w:proofErr w:type="spellStart"/>
       <w:r>
@@ -621,7 +590,6 @@
           <w:rFonts w:ascii="Segoe UI Emoji" w:hAnsi="Segoe UI Emoji" w:cs="Segoe UI Emoji"/>
         </w:rPr>
       </w:pPr>
-      <w:proofErr w:type="gramStart"/>
       <w:r>
         <w:rPr>
           <w:rFonts w:ascii="Segoe UI Emoji" w:hAnsi="Segoe UI Emoji" w:cs="Segoe UI Emoji"/>
@@ -629,11 +597,7 @@
         <w:t>🎉</w:t>
       </w:r>
       <w:r>
-        <w:t>¡</w:t>
-      </w:r>
-      <w:proofErr w:type="gramEnd"/>
-      <w:r>
-        <w:t xml:space="preserve">Felicitaciones por la entrega del Desafío 01! </w:t>
+        <w:t xml:space="preserve">¡Felicitaciones por la entrega del Desafío 01! </w:t>
       </w:r>
       <w:r>
         <w:rPr>
@@ -776,7 +740,6 @@
           <w:rFonts w:ascii="Segoe UI Emoji" w:hAnsi="Segoe UI Emoji" w:cs="Segoe UI Emoji"/>
         </w:rPr>
       </w:pPr>
-      <w:proofErr w:type="gramStart"/>
       <w:r>
         <w:rPr>
           <w:rFonts w:ascii="Segoe UI Emoji" w:hAnsi="Segoe UI Emoji" w:cs="Segoe UI Emoji"/>
@@ -784,11 +747,7 @@
         <w:t>🎉</w:t>
       </w:r>
       <w:r>
-        <w:t>¡</w:t>
-      </w:r>
-      <w:proofErr w:type="gramEnd"/>
-      <w:r>
-        <w:t xml:space="preserve">Felicitaciones por la entrega del Desafío 01! </w:t>
+        <w:t xml:space="preserve">¡Felicitaciones por la entrega del Desafío 01! </w:t>
       </w:r>
       <w:r>
         <w:rPr>
@@ -848,15 +807,7 @@
       </w:r>
       <w:proofErr w:type="spellEnd"/>
       <w:r>
-        <w:t xml:space="preserve"> que </w:t>
-      </w:r>
-      <w:proofErr w:type="gramStart"/>
-      <w:r>
-        <w:t>le</w:t>
-      </w:r>
-      <w:proofErr w:type="gramEnd"/>
-      <w:r>
-        <w:t xml:space="preserve"> dice a los motores de búsqueda que esa </w:t>
+        <w:t xml:space="preserve"> que le dice a los motores de búsqueda que esa </w:t>
       </w:r>
       <w:proofErr w:type="spellStart"/>
       <w:r>
@@ -872,15 +823,7 @@
       </w:r>
       <w:proofErr w:type="spellEnd"/>
       <w:r>
-        <w:t xml:space="preserve">, por lo cual es recomendable utilizarla con recaudo. Por </w:t>
-      </w:r>
-      <w:proofErr w:type="gramStart"/>
-      <w:r>
-        <w:t>ejemplo</w:t>
-      </w:r>
-      <w:proofErr w:type="gramEnd"/>
-      <w:r>
-        <w:t xml:space="preserve"> en la parte del significado del término MERN que la primer letra del </w:t>
+        <w:t xml:space="preserve">, por lo cual es recomendable utilizarla con recaudo. Por ejemplo en la parte del significado del término MERN que la primer letra del </w:t>
       </w:r>
       <w:proofErr w:type="spellStart"/>
       <w:r>
@@ -1012,7 +955,6 @@
           <w:rFonts w:ascii="Segoe UI Emoji" w:hAnsi="Segoe UI Emoji" w:cs="Segoe UI Emoji"/>
         </w:rPr>
       </w:pPr>
-      <w:proofErr w:type="gramStart"/>
       <w:r>
         <w:rPr>
           <w:rFonts w:ascii="Segoe UI Emoji" w:hAnsi="Segoe UI Emoji" w:cs="Segoe UI Emoji"/>
@@ -1020,11 +962,7 @@
         <w:t>🎉</w:t>
       </w:r>
       <w:r>
-        <w:t>¡</w:t>
-      </w:r>
-      <w:proofErr w:type="gramEnd"/>
-      <w:r>
-        <w:t xml:space="preserve">Felicitaciones por la entrega del Desafío 01! </w:t>
+        <w:t xml:space="preserve">¡Felicitaciones por la entrega del Desafío 01! </w:t>
       </w:r>
       <w:r>
         <w:rPr>
@@ -1111,15 +1049,7 @@
       </w:r>
       <w:proofErr w:type="spellEnd"/>
       <w:r>
-        <w:t xml:space="preserve">="es"&gt; porque esto </w:t>
-      </w:r>
-      <w:proofErr w:type="gramStart"/>
-      <w:r>
-        <w:t>le</w:t>
-      </w:r>
-      <w:proofErr w:type="gramEnd"/>
-      <w:r>
-        <w:t xml:space="preserve"> dice a los motores de búsqueda en que idioma esta tu sitio web.</w:t>
+        <w:t>="es"&gt; porque esto le dice a los motores de búsqueda en que idioma esta tu sitio web.</w:t>
       </w:r>
     </w:p>
     <w:p/>
@@ -1186,7 +1116,6 @@
           <w:rFonts w:ascii="Segoe UI Emoji" w:hAnsi="Segoe UI Emoji" w:cs="Segoe UI Emoji"/>
         </w:rPr>
       </w:pPr>
-      <w:proofErr w:type="gramStart"/>
       <w:r>
         <w:rPr>
           <w:rFonts w:ascii="Segoe UI Emoji" w:hAnsi="Segoe UI Emoji" w:cs="Segoe UI Emoji"/>
@@ -1194,11 +1123,7 @@
         <w:t>🎉</w:t>
       </w:r>
       <w:r>
-        <w:t>¡</w:t>
-      </w:r>
-      <w:proofErr w:type="gramEnd"/>
-      <w:r>
-        <w:t xml:space="preserve">Felicitaciones por la entrega del Desafío 01! </w:t>
+        <w:t xml:space="preserve">¡Felicitaciones por la entrega del Desafío 01! </w:t>
       </w:r>
       <w:r>
         <w:rPr>
@@ -1284,15 +1209,7 @@
       </w:r>
       <w:proofErr w:type="spellEnd"/>
       <w:r>
-        <w:t xml:space="preserve">="es"&gt; porque esto </w:t>
-      </w:r>
-      <w:proofErr w:type="gramStart"/>
-      <w:r>
-        <w:t>le</w:t>
-      </w:r>
-      <w:proofErr w:type="gramEnd"/>
-      <w:r>
-        <w:t xml:space="preserve"> dice a los motores de búsqueda en que idioma esta tu sitio web.</w:t>
+        <w:t>="es"&gt; porque esto le dice a los motores de búsqueda en que idioma esta tu sitio web.</w:t>
       </w:r>
     </w:p>
     <w:p/>
@@ -1417,7 +1334,6 @@
           <w:rFonts w:ascii="Segoe UI Emoji" w:hAnsi="Segoe UI Emoji" w:cs="Segoe UI Emoji"/>
         </w:rPr>
       </w:pPr>
-      <w:proofErr w:type="gramStart"/>
       <w:r>
         <w:rPr>
           <w:rFonts w:ascii="Segoe UI Emoji" w:hAnsi="Segoe UI Emoji" w:cs="Segoe UI Emoji"/>
@@ -1425,11 +1341,7 @@
         <w:t>🎉</w:t>
       </w:r>
       <w:r>
-        <w:t>¡</w:t>
-      </w:r>
-      <w:proofErr w:type="gramEnd"/>
-      <w:r>
-        <w:t xml:space="preserve">Felicitaciones por la entrega del Desafío 01! </w:t>
+        <w:t xml:space="preserve">¡Felicitaciones por la entrega del Desafío 01! </w:t>
       </w:r>
       <w:r>
         <w:rPr>
@@ -1490,15 +1402,7 @@
       </w:r>
       <w:proofErr w:type="spellEnd"/>
       <w:r>
-        <w:t xml:space="preserve">="es"&gt; porque esto </w:t>
-      </w:r>
-      <w:proofErr w:type="gramStart"/>
-      <w:r>
-        <w:t>le</w:t>
-      </w:r>
-      <w:proofErr w:type="gramEnd"/>
-      <w:r>
-        <w:t xml:space="preserve"> dice a los motores de búsqueda en que idioma esta tu sitio web.</w:t>
+        <w:t>="es"&gt; porque esto le dice a los motores de búsqueda en que idioma esta tu sitio web.</w:t>
       </w:r>
     </w:p>
     <w:p/>
@@ -1608,7 +1512,6 @@
           <w:rFonts w:ascii="Segoe UI Emoji" w:hAnsi="Segoe UI Emoji" w:cs="Segoe UI Emoji"/>
         </w:rPr>
       </w:pPr>
-      <w:proofErr w:type="gramStart"/>
       <w:r>
         <w:rPr>
           <w:rFonts w:ascii="Segoe UI Emoji" w:hAnsi="Segoe UI Emoji" w:cs="Segoe UI Emoji"/>
@@ -1616,11 +1519,7 @@
         <w:t>🎉</w:t>
       </w:r>
       <w:r>
-        <w:t>¡</w:t>
-      </w:r>
-      <w:proofErr w:type="gramEnd"/>
-      <w:r>
-        <w:t xml:space="preserve">Felicitaciones por la entrega del Desafío 01! </w:t>
+        <w:t xml:space="preserve">¡Felicitaciones por la entrega del Desafío 01! </w:t>
       </w:r>
       <w:r>
         <w:rPr>
@@ -1680,15 +1579,7 @@
       </w:r>
       <w:proofErr w:type="spellEnd"/>
       <w:r>
-        <w:t xml:space="preserve">="es"&gt; porque esto </w:t>
-      </w:r>
-      <w:proofErr w:type="gramStart"/>
-      <w:r>
-        <w:t>le</w:t>
-      </w:r>
-      <w:proofErr w:type="gramEnd"/>
-      <w:r>
-        <w:t xml:space="preserve"> dice a los motores de búsqueda en que idioma esta tu sitio web.</w:t>
+        <w:t>="es"&gt; porque esto le dice a los motores de búsqueda en que idioma esta tu sitio web.</w:t>
       </w:r>
     </w:p>
     <w:p/>
@@ -1752,7 +1643,6 @@
           <w:rFonts w:ascii="Segoe UI Emoji" w:hAnsi="Segoe UI Emoji" w:cs="Segoe UI Emoji"/>
         </w:rPr>
       </w:pPr>
-      <w:proofErr w:type="gramStart"/>
       <w:r>
         <w:rPr>
           <w:rFonts w:ascii="Segoe UI Emoji" w:hAnsi="Segoe UI Emoji" w:cs="Segoe UI Emoji"/>
@@ -1760,11 +1650,7 @@
         <w:t>🎉</w:t>
       </w:r>
       <w:r>
-        <w:t>¡</w:t>
-      </w:r>
-      <w:proofErr w:type="gramEnd"/>
-      <w:r>
-        <w:t xml:space="preserve">Felicitaciones por la entrega del Desafío 01! </w:t>
+        <w:t xml:space="preserve">¡Felicitaciones por la entrega del Desafío 01! </w:t>
       </w:r>
       <w:r>
         <w:rPr>
@@ -1816,15 +1702,7 @@
       </w:r>
       <w:proofErr w:type="spellEnd"/>
       <w:r>
-        <w:t xml:space="preserve">="es"&gt; porque esto </w:t>
-      </w:r>
-      <w:proofErr w:type="gramStart"/>
-      <w:r>
-        <w:t>le</w:t>
-      </w:r>
-      <w:proofErr w:type="gramEnd"/>
-      <w:r>
-        <w:t xml:space="preserve"> dice a los motores de búsqueda en que idioma esta tu sitio web.</w:t>
+        <w:t>="es"&gt; porque esto le dice a los motores de búsqueda en que idioma esta tu sitio web.</w:t>
       </w:r>
     </w:p>
     <w:p/>
@@ -1846,15 +1724,7 @@
       </w:r>
       <w:proofErr w:type="spellEnd"/>
       <w:r>
-        <w:t xml:space="preserve"> que </w:t>
-      </w:r>
-      <w:proofErr w:type="gramStart"/>
-      <w:r>
-        <w:t>le</w:t>
-      </w:r>
-      <w:proofErr w:type="gramEnd"/>
-      <w:r>
-        <w:t xml:space="preserve"> dice a los motores de búsqueda que esa </w:t>
+        <w:t xml:space="preserve"> que le dice a los motores de búsqueda que esa </w:t>
       </w:r>
       <w:proofErr w:type="spellStart"/>
       <w:r>
@@ -1862,15 +1732,7 @@
       </w:r>
       <w:proofErr w:type="spellEnd"/>
       <w:r>
-        <w:t xml:space="preserve"> es importante y que la tome en cuenta cuando imprime los resultados de búsqueda, por lo cual es recomendable utilizarla con recaudo. Por </w:t>
-      </w:r>
-      <w:proofErr w:type="gramStart"/>
-      <w:r>
-        <w:t>ejemplo</w:t>
-      </w:r>
-      <w:proofErr w:type="gramEnd"/>
-      <w:r>
-        <w:t xml:space="preserve"> en la parte del significado del término MERN que la primer letra del </w:t>
+        <w:t xml:space="preserve"> es importante y que la tome en cuenta cuando imprime los resultados de búsqueda, por lo cual es recomendable utilizarla con recaudo. Por ejemplo en la parte del significado del término MERN que la primer letra del </w:t>
       </w:r>
       <w:proofErr w:type="spellStart"/>
       <w:r>
@@ -1981,7 +1843,6 @@
           <w:rFonts w:ascii="Segoe UI Emoji" w:hAnsi="Segoe UI Emoji" w:cs="Segoe UI Emoji"/>
         </w:rPr>
       </w:pPr>
-      <w:proofErr w:type="gramStart"/>
       <w:r>
         <w:rPr>
           <w:rFonts w:ascii="Segoe UI Emoji" w:hAnsi="Segoe UI Emoji" w:cs="Segoe UI Emoji"/>
@@ -1989,11 +1850,7 @@
         <w:t>🎉</w:t>
       </w:r>
       <w:r>
-        <w:t>¡</w:t>
-      </w:r>
-      <w:proofErr w:type="gramEnd"/>
-      <w:r>
-        <w:t xml:space="preserve">Felicitaciones por la entrega del Desafío 01! </w:t>
+        <w:t xml:space="preserve">¡Felicitaciones por la entrega del Desafío 01! </w:t>
       </w:r>
       <w:r>
         <w:rPr>
@@ -2108,7 +1965,6 @@
           <w:rFonts w:ascii="Segoe UI Emoji" w:hAnsi="Segoe UI Emoji" w:cs="Segoe UI Emoji"/>
         </w:rPr>
       </w:pPr>
-      <w:proofErr w:type="gramStart"/>
       <w:r>
         <w:rPr>
           <w:rFonts w:ascii="Segoe UI Emoji" w:hAnsi="Segoe UI Emoji" w:cs="Segoe UI Emoji"/>
@@ -2117,11 +1973,7 @@
         <w:t>🎉</w:t>
       </w:r>
       <w:r>
-        <w:t>¡</w:t>
-      </w:r>
-      <w:proofErr w:type="gramEnd"/>
-      <w:r>
-        <w:t xml:space="preserve">Felicitaciones por la entrega del Desafío 01! </w:t>
+        <w:t xml:space="preserve">¡Felicitaciones por la entrega del Desafío 01! </w:t>
       </w:r>
       <w:r>
         <w:rPr>
@@ -2179,15 +2031,7 @@
       </w:r>
       <w:proofErr w:type="spellEnd"/>
       <w:r>
-        <w:t xml:space="preserve">="es"&gt; porque esto </w:t>
-      </w:r>
-      <w:proofErr w:type="gramStart"/>
-      <w:r>
-        <w:t>le</w:t>
-      </w:r>
-      <w:proofErr w:type="gramEnd"/>
-      <w:r>
-        <w:t xml:space="preserve"> dice a los motores de búsqueda en que idioma esta tu sitio web.</w:t>
+        <w:t>="es"&gt; porque esto le dice a los motores de búsqueda en que idioma esta tu sitio web.</w:t>
       </w:r>
     </w:p>
     <w:p/>
@@ -2501,7 +2345,6 @@
           <w:rFonts w:ascii="Segoe UI Emoji" w:hAnsi="Segoe UI Emoji" w:cs="Segoe UI Emoji"/>
         </w:rPr>
       </w:pPr>
-      <w:proofErr w:type="gramStart"/>
       <w:r>
         <w:rPr>
           <w:rFonts w:ascii="Segoe UI Emoji" w:hAnsi="Segoe UI Emoji" w:cs="Segoe UI Emoji"/>
@@ -2509,11 +2352,7 @@
         <w:t>🎉</w:t>
       </w:r>
       <w:r>
-        <w:t>¡</w:t>
-      </w:r>
-      <w:proofErr w:type="gramEnd"/>
-      <w:r>
-        <w:t xml:space="preserve">Felicitaciones por la entrega del Desafío 01! </w:t>
+        <w:t xml:space="preserve">¡Felicitaciones por la entrega del Desafío 01! </w:t>
       </w:r>
       <w:r>
         <w:rPr>
@@ -2595,15 +2434,7 @@
       </w:r>
       <w:proofErr w:type="spellEnd"/>
       <w:r>
-        <w:t xml:space="preserve">="es"&gt; porque esto </w:t>
-      </w:r>
-      <w:proofErr w:type="gramStart"/>
-      <w:r>
-        <w:t>le</w:t>
-      </w:r>
-      <w:proofErr w:type="gramEnd"/>
-      <w:r>
-        <w:t xml:space="preserve"> dice a los motores de búsqueda en que idioma esta tu sitio web.</w:t>
+        <w:t>="es"&gt; porque esto le dice a los motores de búsqueda en que idioma esta tu sitio web.</w:t>
       </w:r>
     </w:p>
     <w:p/>
@@ -2687,7 +2518,6 @@
           <w:rFonts w:ascii="Segoe UI Emoji" w:hAnsi="Segoe UI Emoji" w:cs="Segoe UI Emoji"/>
         </w:rPr>
       </w:pPr>
-      <w:proofErr w:type="gramStart"/>
       <w:r>
         <w:rPr>
           <w:rFonts w:ascii="Segoe UI Emoji" w:hAnsi="Segoe UI Emoji" w:cs="Segoe UI Emoji"/>
@@ -2695,11 +2525,7 @@
         <w:t>🎉</w:t>
       </w:r>
       <w:r>
-        <w:t>¡</w:t>
-      </w:r>
-      <w:proofErr w:type="gramEnd"/>
-      <w:r>
-        <w:t xml:space="preserve">Felicitaciones por la entrega del Desafío 01! </w:t>
+        <w:t xml:space="preserve">¡Felicitaciones por la entrega del Desafío 01! </w:t>
       </w:r>
       <w:r>
         <w:rPr>
@@ -2772,15 +2598,7 @@
       </w:r>
       <w:proofErr w:type="spellEnd"/>
       <w:r>
-        <w:t xml:space="preserve">="es"&gt; porque esto </w:t>
-      </w:r>
-      <w:proofErr w:type="gramStart"/>
-      <w:r>
-        <w:t>le</w:t>
-      </w:r>
-      <w:proofErr w:type="gramEnd"/>
-      <w:r>
-        <w:t xml:space="preserve"> dice a los motores de búsqueda en que idioma esta tu sitio web.</w:t>
+        <w:t>="es"&gt; porque esto le dice a los motores de búsqueda en que idioma esta tu sitio web.</w:t>
       </w:r>
     </w:p>
     <w:p/>
@@ -2888,7 +2706,6 @@
           <w:rFonts w:ascii="Segoe UI Emoji" w:hAnsi="Segoe UI Emoji" w:cs="Segoe UI Emoji"/>
         </w:rPr>
       </w:pPr>
-      <w:proofErr w:type="gramStart"/>
       <w:r>
         <w:rPr>
           <w:rFonts w:ascii="Segoe UI Emoji" w:hAnsi="Segoe UI Emoji" w:cs="Segoe UI Emoji"/>
@@ -2896,11 +2713,7 @@
         <w:t>🎉</w:t>
       </w:r>
       <w:r>
-        <w:t>¡</w:t>
-      </w:r>
-      <w:proofErr w:type="gramEnd"/>
-      <w:r>
-        <w:t xml:space="preserve">Felicitaciones por la entrega del Desafío 01! </w:t>
+        <w:t xml:space="preserve">¡Felicitaciones por la entrega del Desafío 01! </w:t>
       </w:r>
       <w:r>
         <w:rPr>
@@ -2972,15 +2785,7 @@
       </w:r>
       <w:proofErr w:type="spellEnd"/>
       <w:r>
-        <w:t xml:space="preserve">="es"&gt; porque esto </w:t>
-      </w:r>
-      <w:proofErr w:type="gramStart"/>
-      <w:r>
-        <w:t>le</w:t>
-      </w:r>
-      <w:proofErr w:type="gramEnd"/>
-      <w:r>
-        <w:t xml:space="preserve"> dice a los motores de búsqueda en que idioma esta tu sitio web.</w:t>
+        <w:t>="es"&gt; porque esto le dice a los motores de búsqueda en que idioma esta tu sitio web.</w:t>
       </w:r>
     </w:p>
     <w:p/>
@@ -3050,7 +2855,6 @@
           <w:rFonts w:ascii="Segoe UI Emoji" w:hAnsi="Segoe UI Emoji" w:cs="Segoe UI Emoji"/>
         </w:rPr>
       </w:pPr>
-      <w:proofErr w:type="gramStart"/>
       <w:r>
         <w:rPr>
           <w:rFonts w:ascii="Segoe UI Emoji" w:hAnsi="Segoe UI Emoji" w:cs="Segoe UI Emoji"/>
@@ -3058,11 +2862,7 @@
         <w:t>🎉</w:t>
       </w:r>
       <w:r>
-        <w:t>¡</w:t>
-      </w:r>
-      <w:proofErr w:type="gramEnd"/>
-      <w:r>
-        <w:t xml:space="preserve">Felicitaciones por la entrega del Desafío 01! </w:t>
+        <w:t xml:space="preserve">¡Felicitaciones por la entrega del Desafío 01! </w:t>
       </w:r>
       <w:r>
         <w:rPr>
@@ -3092,10 +2892,7 @@
     <w:p/>
     <w:p>
       <w:r>
-        <w:t xml:space="preserve">Buenísimo que </w:t>
-      </w:r>
-      <w:r>
-        <w:t>aplicaste etiquetas &lt;b&gt; para resaltar en negrita textos, te falto aplicar palabras claves con etiquetas &lt;</w:t>
+        <w:t>Buenísimo que aplicaste etiquetas &lt;b&gt; para resaltar en negrita textos, te falto aplicar palabras claves con etiquetas &lt;</w:t>
       </w:r>
       <w:proofErr w:type="spellStart"/>
       <w:r>
@@ -3202,7 +2999,6 @@
           <w:rFonts w:ascii="Segoe UI Emoji" w:hAnsi="Segoe UI Emoji" w:cs="Segoe UI Emoji"/>
         </w:rPr>
       </w:pPr>
-      <w:proofErr w:type="gramStart"/>
       <w:r>
         <w:rPr>
           <w:rFonts w:ascii="Segoe UI Emoji" w:hAnsi="Segoe UI Emoji" w:cs="Segoe UI Emoji"/>
@@ -3211,11 +3007,7 @@
         <w:t>🎉</w:t>
       </w:r>
       <w:r>
-        <w:t>¡</w:t>
-      </w:r>
-      <w:proofErr w:type="gramEnd"/>
-      <w:r>
-        <w:t xml:space="preserve">Felicitaciones por la entrega del Desafío 01! </w:t>
+        <w:t xml:space="preserve">¡Felicitaciones por la entrega del Desafío 01! </w:t>
       </w:r>
       <w:r>
         <w:rPr>
@@ -3356,7 +3148,6 @@
           <w:rFonts w:ascii="Segoe UI Emoji" w:hAnsi="Segoe UI Emoji" w:cs="Segoe UI Emoji"/>
         </w:rPr>
       </w:pPr>
-      <w:proofErr w:type="gramStart"/>
       <w:r>
         <w:rPr>
           <w:rFonts w:ascii="Segoe UI Emoji" w:hAnsi="Segoe UI Emoji" w:cs="Segoe UI Emoji"/>
@@ -3364,11 +3155,7 @@
         <w:t>🎉</w:t>
       </w:r>
       <w:r>
-        <w:t>¡</w:t>
-      </w:r>
-      <w:proofErr w:type="gramEnd"/>
-      <w:r>
-        <w:t xml:space="preserve">Felicitaciones por la entrega del Desafío 01! </w:t>
+        <w:t xml:space="preserve">¡Felicitaciones por la entrega del Desafío 01! </w:t>
       </w:r>
       <w:r>
         <w:rPr>
@@ -3421,15 +3208,7 @@
       </w:r>
       <w:proofErr w:type="spellEnd"/>
       <w:r>
-        <w:t xml:space="preserve">="es"&gt;, porque </w:t>
-      </w:r>
-      <w:proofErr w:type="gramStart"/>
-      <w:r>
-        <w:t>le</w:t>
-      </w:r>
-      <w:proofErr w:type="gramEnd"/>
-      <w:r>
-        <w:t xml:space="preserve"> dice a los motores de búsqueda en que idioma esta tu sitio web.</w:t>
+        <w:t>="es"&gt;, porque le dice a los motores de búsqueda en que idioma esta tu sitio web.</w:t>
       </w:r>
     </w:p>
     <w:p/>
@@ -3454,15 +3233,7 @@
       </w:r>
       <w:proofErr w:type="spellEnd"/>
       <w:r>
-        <w:t xml:space="preserve"> que </w:t>
-      </w:r>
-      <w:proofErr w:type="gramStart"/>
-      <w:r>
-        <w:t>le</w:t>
-      </w:r>
-      <w:proofErr w:type="gramEnd"/>
-      <w:r>
-        <w:t xml:space="preserve"> dice a los motores de búsqueda que esa </w:t>
+        <w:t xml:space="preserve"> que le dice a los motores de búsqueda que esa </w:t>
       </w:r>
       <w:proofErr w:type="spellStart"/>
       <w:r>
@@ -3470,15 +3241,7 @@
       </w:r>
       <w:proofErr w:type="spellEnd"/>
       <w:r>
-        <w:t xml:space="preserve"> es importante y que la tome en cuenta cuando imprime los resultados de búsqueda, por lo cual es recomendable utilizarla con recaudo. Por </w:t>
-      </w:r>
-      <w:proofErr w:type="gramStart"/>
-      <w:r>
-        <w:t>ejemplo</w:t>
-      </w:r>
-      <w:proofErr w:type="gramEnd"/>
-      <w:r>
-        <w:t xml:space="preserve"> en la parte del significado del término MERN que la primer letra del </w:t>
+        <w:t xml:space="preserve"> es importante y que la tome en cuenta cuando imprime los resultados de búsqueda, por lo cual es recomendable utilizarla con recaudo. Por ejemplo en la parte del significado del término MERN que la primer letra del </w:t>
       </w:r>
       <w:proofErr w:type="spellStart"/>
       <w:r>
@@ -3502,10 +3265,7 @@
       </w:r>
       <w:proofErr w:type="spellEnd"/>
       <w:r>
-        <w:t xml:space="preserve"> que todo de estética visual para el usuario</w:t>
-      </w:r>
-      <w:r>
-        <w:t>:</w:t>
+        <w:t xml:space="preserve"> que todo de estética visual para el usuario:</w:t>
       </w:r>
     </w:p>
     <w:p>
@@ -3553,7 +3313,6 @@
         <w:t>&lt;/b&gt;</w:t>
       </w:r>
       <w:proofErr w:type="spellStart"/>
-      <w:proofErr w:type="gramStart"/>
       <w:r>
         <w:t>o</w:t>
       </w:r>
@@ -3564,7 +3323,6 @@
       <w:r>
         <w:t>….</w:t>
       </w:r>
-      <w:proofErr w:type="gramEnd"/>
       <w:r>
         <w:t>&lt;/</w:t>
       </w:r>
@@ -3618,16 +3376,11 @@
         <w:t>N</w:t>
       </w:r>
       <w:r>
-        <w:t>&lt;/</w:t>
-      </w:r>
-      <w:proofErr w:type="gramStart"/>
-      <w:r>
-        <w:t>b</w:t>
+        <w:t>&lt;/b</w:t>
       </w:r>
       <w:r>
         <w:t>ode.js….</w:t>
       </w:r>
-      <w:proofErr w:type="gramEnd"/>
       <w:r>
         <w:t>&lt;/</w:t>
       </w:r>
@@ -3708,25 +3461,24 @@
           <w:b/>
           <w:bCs/>
         </w:rPr>
-        <w:t>Martin Luciano Federico</w:t>
-      </w:r>
-    </w:p>
-    <w:p>
-      <w:pPr>
-        <w:rPr>
-          <w:rFonts w:ascii="Segoe UI Emoji" w:hAnsi="Segoe UI Emoji" w:cs="Segoe UI Emoji"/>
-          <w:b/>
-          <w:bCs/>
-        </w:rPr>
-      </w:pPr>
-    </w:p>
-    <w:p>
-      <w:pPr>
-        <w:rPr>
-          <w:rFonts w:ascii="Segoe UI Emoji" w:hAnsi="Segoe UI Emoji" w:cs="Segoe UI Emoji"/>
-        </w:rPr>
-      </w:pPr>
-      <w:proofErr w:type="gramStart"/>
+        <w:t>Montero Micaela</w:t>
+      </w:r>
+    </w:p>
+    <w:p>
+      <w:pPr>
+        <w:rPr>
+          <w:rFonts w:ascii="Segoe UI Emoji" w:hAnsi="Segoe UI Emoji" w:cs="Segoe UI Emoji"/>
+          <w:b/>
+          <w:bCs/>
+        </w:rPr>
+      </w:pPr>
+    </w:p>
+    <w:p>
+      <w:pPr>
+        <w:rPr>
+          <w:rFonts w:ascii="Segoe UI Emoji" w:hAnsi="Segoe UI Emoji" w:cs="Segoe UI Emoji"/>
+        </w:rPr>
+      </w:pPr>
       <w:r>
         <w:rPr>
           <w:rFonts w:ascii="Segoe UI Emoji" w:hAnsi="Segoe UI Emoji" w:cs="Segoe UI Emoji"/>
@@ -3734,11 +3486,7 @@
         <w:t>🎉</w:t>
       </w:r>
       <w:r>
-        <w:t>¡</w:t>
-      </w:r>
-      <w:proofErr w:type="gramEnd"/>
-      <w:r>
-        <w:t xml:space="preserve">Felicitaciones por la entrega del Desafío 01! </w:t>
+        <w:t xml:space="preserve">¡Felicitaciones por la entrega del Desafío 01! </w:t>
       </w:r>
       <w:r>
         <w:rPr>
@@ -3748,55 +3496,264 @@
       </w:r>
     </w:p>
     <w:p/>
-    <w:p/>
     <w:p>
       <w:r>
         <w:lastRenderedPageBreak/>
-        <w:t>Primeramente, quería felicitarte por el trabajo que realizaste. El resultado visual se ve como el de las imágenes de referencia.</w:t>
-      </w:r>
-    </w:p>
-    <w:p/>
-    <w:p>
-      <w:r>
-        <w:t xml:space="preserve">El manejo de etiquetas para textos y la estructura del documento </w:t>
-      </w:r>
-      <w:proofErr w:type="spellStart"/>
-      <w:r>
-        <w:t>html</w:t>
-      </w:r>
-      <w:proofErr w:type="spellEnd"/>
-      <w:r>
-        <w:t xml:space="preserve"> es correcto</w:t>
-      </w:r>
-    </w:p>
-    <w:p/>
-    <w:p>
-      <w:r>
-        <w:t>Destaco que recordaste cambiar el lenguaje a español &lt;</w:t>
-      </w:r>
-      <w:proofErr w:type="spellStart"/>
-      <w:r>
-        <w:t>html</w:t>
-      </w:r>
-      <w:proofErr w:type="spellEnd"/>
-      <w:r>
-        <w:t xml:space="preserve"> </w:t>
-      </w:r>
-      <w:proofErr w:type="spellStart"/>
-      <w:r>
-        <w:t>lang</w:t>
-      </w:r>
-      <w:proofErr w:type="spellEnd"/>
-      <w:r>
-        <w:t xml:space="preserve">="es"&gt; lo cual es bueno, porque </w:t>
-      </w:r>
-      <w:proofErr w:type="gramStart"/>
-      <w:r>
-        <w:t>le</w:t>
-      </w:r>
-      <w:proofErr w:type="gramEnd"/>
-      <w:r>
-        <w:t xml:space="preserve"> dice a los motores de búsqueda en que idioma esta tu sitio web.</w:t>
+        <w:t>Micaela</w:t>
+      </w:r>
+      <w:r>
+        <w:t>, quería felicitarte por el trabajo que realizaste. El resultado renderizado es el solicitado.</w:t>
+      </w:r>
+    </w:p>
+    <w:p/>
+    <w:p>
+      <w:r>
+        <w:t>Destaco la correcta estructura del documento HTML, genial que hayas declarado el lenguaje del documento en español, estos pequeños detalles van sumando a la legibilidad de la estructura.</w:t>
+      </w:r>
+    </w:p>
+    <w:p/>
+    <w:p>
+      <w:r>
+        <w:t xml:space="preserve">Respetaste el orden de aplicación de uso de etiquetas de encabezado (h1, h2, etc..) y el manejo de etiquetas para textos es correcto. </w:t>
+      </w:r>
+    </w:p>
+    <w:p/>
+    <w:p>
+      <w:r>
+        <w:t>Buenísimo que hayas diferenciado cuando usar etiquetas &lt;</w:t>
+      </w:r>
+      <w:proofErr w:type="spellStart"/>
+      <w:r>
+        <w:t>strong</w:t>
+      </w:r>
+      <w:proofErr w:type="spellEnd"/>
+      <w:r>
+        <w:t xml:space="preserve">&gt; y &lt;b&gt; </w:t>
+      </w:r>
+    </w:p>
+    <w:p/>
+    <w:p/>
+    <w:p>
+      <w:r>
+        <w:t>Excelente trabajo ¡</w:t>
+      </w:r>
+    </w:p>
+    <w:p/>
+    <w:p>
+      <w:r>
+        <w:t xml:space="preserve">Tu nota en el Desafío 01 es: </w:t>
+      </w:r>
+      <w:r>
+        <w:rPr>
+          <w:b/>
+          <w:bCs/>
+        </w:rPr>
+        <w:t>10</w:t>
+      </w:r>
+    </w:p>
+    <w:p/>
+    <w:p>
+      <w:pPr>
+        <w:pBdr>
+          <w:bottom w:val="single" w:sz="6" w:space="1" w:color="auto"/>
+        </w:pBdr>
+      </w:pPr>
+    </w:p>
+    <w:p/>
+    <w:p>
+      <w:pPr>
+        <w:rPr>
+          <w:rFonts w:ascii="Segoe UI Emoji" w:hAnsi="Segoe UI Emoji" w:cs="Segoe UI Emoji"/>
+          <w:b/>
+          <w:bCs/>
+        </w:rPr>
+      </w:pPr>
+      <w:r>
+        <w:rPr>
+          <w:rFonts w:ascii="Segoe UI Emoji" w:hAnsi="Segoe UI Emoji" w:cs="Segoe UI Emoji"/>
+          <w:b/>
+          <w:bCs/>
+        </w:rPr>
+        <w:t>Zabala Pons Gonzalo</w:t>
+      </w:r>
+    </w:p>
+    <w:p>
+      <w:pPr>
+        <w:rPr>
+          <w:rFonts w:ascii="Segoe UI Emoji" w:hAnsi="Segoe UI Emoji" w:cs="Segoe UI Emoji"/>
+          <w:b/>
+          <w:bCs/>
+        </w:rPr>
+      </w:pPr>
+    </w:p>
+    <w:p>
+      <w:pPr>
+        <w:rPr>
+          <w:rFonts w:ascii="Segoe UI Emoji" w:hAnsi="Segoe UI Emoji" w:cs="Segoe UI Emoji"/>
+        </w:rPr>
+      </w:pPr>
+      <w:r>
+        <w:rPr>
+          <w:rFonts w:ascii="Segoe UI Emoji" w:hAnsi="Segoe UI Emoji" w:cs="Segoe UI Emoji"/>
+        </w:rPr>
+        <w:t>🎉</w:t>
+      </w:r>
+      <w:r>
+        <w:t xml:space="preserve">¡Felicitaciones por la entrega del Desafío 01! </w:t>
+      </w:r>
+      <w:r>
+        <w:rPr>
+          <w:rFonts w:ascii="Segoe UI Emoji" w:hAnsi="Segoe UI Emoji" w:cs="Segoe UI Emoji"/>
+        </w:rPr>
+        <w:t>🎉</w:t>
+      </w:r>
+    </w:p>
+    <w:p>
+      <w:pPr>
+        <w:rPr>
+          <w:rFonts w:ascii="Segoe UI Emoji" w:hAnsi="Segoe UI Emoji" w:cs="Segoe UI Emoji"/>
+          <w:b/>
+          <w:bCs/>
+        </w:rPr>
+      </w:pPr>
+    </w:p>
+    <w:p>
+      <w:r>
+        <w:t>Gonzalo</w:t>
+      </w:r>
+      <w:r>
+        <w:t>, quería felicitarte por el trabajo que realizaste. El resultado renderizado es el solicitado.</w:t>
+      </w:r>
+    </w:p>
+    <w:p/>
+    <w:p>
+      <w:r>
+        <w:t>Destaco la correcta estructura del documento HTML, genial que hayas declarado el lenguaje del documento en español, estos pequeños detalles van sumando a la legibilidad de la estructura.</w:t>
+      </w:r>
+    </w:p>
+    <w:p/>
+    <w:p>
+      <w:r>
+        <w:t xml:space="preserve">Respetaste el orden de aplicación de uso de etiquetas de encabezado (h1, h2, etc..) y el manejo de etiquetas para textos es correcto. </w:t>
+      </w:r>
+    </w:p>
+    <w:p/>
+    <w:p>
+      <w:r>
+        <w:t>Buenísimo que hayas diferenciado cuando usar etiquetas &lt;</w:t>
+      </w:r>
+      <w:proofErr w:type="spellStart"/>
+      <w:r>
+        <w:t>strong</w:t>
+      </w:r>
+      <w:proofErr w:type="spellEnd"/>
+      <w:r>
+        <w:t xml:space="preserve">&gt; y &lt;b&gt; </w:t>
+      </w:r>
+    </w:p>
+    <w:p/>
+    <w:p/>
+    <w:p>
+      <w:r>
+        <w:t>Excelente trabajo ¡</w:t>
+      </w:r>
+    </w:p>
+    <w:p/>
+    <w:p>
+      <w:r>
+        <w:t xml:space="preserve">Tu nota en el Desafío 01 es: </w:t>
+      </w:r>
+      <w:r>
+        <w:rPr>
+          <w:b/>
+          <w:bCs/>
+        </w:rPr>
+        <w:t>10</w:t>
+      </w:r>
+    </w:p>
+    <w:p>
+      <w:pPr>
+        <w:pBdr>
+          <w:bottom w:val="single" w:sz="6" w:space="1" w:color="auto"/>
+        </w:pBdr>
+      </w:pPr>
+    </w:p>
+    <w:p>
+      <w:pPr>
+        <w:pBdr>
+          <w:bottom w:val="single" w:sz="6" w:space="1" w:color="auto"/>
+        </w:pBdr>
+      </w:pPr>
+    </w:p>
+    <w:p/>
+    <w:p>
+      <w:pPr>
+        <w:rPr>
+          <w:rFonts w:ascii="Segoe UI Emoji" w:hAnsi="Segoe UI Emoji" w:cs="Segoe UI Emoji"/>
+          <w:b/>
+          <w:bCs/>
+        </w:rPr>
+      </w:pPr>
+      <w:r>
+        <w:rPr>
+          <w:rFonts w:ascii="Segoe UI Emoji" w:hAnsi="Segoe UI Emoji" w:cs="Segoe UI Emoji"/>
+          <w:b/>
+          <w:bCs/>
+        </w:rPr>
+        <w:t xml:space="preserve">Core </w:t>
+      </w:r>
+      <w:proofErr w:type="spellStart"/>
+      <w:r>
+        <w:rPr>
+          <w:rFonts w:ascii="Segoe UI Emoji" w:hAnsi="Segoe UI Emoji" w:cs="Segoe UI Emoji"/>
+          <w:b/>
+          <w:bCs/>
+        </w:rPr>
+        <w:t>Maximo</w:t>
+      </w:r>
+      <w:proofErr w:type="spellEnd"/>
+    </w:p>
+    <w:p>
+      <w:pPr>
+        <w:rPr>
+          <w:rFonts w:ascii="Segoe UI Emoji" w:hAnsi="Segoe UI Emoji" w:cs="Segoe UI Emoji"/>
+          <w:b/>
+          <w:bCs/>
+        </w:rPr>
+      </w:pPr>
+    </w:p>
+    <w:p>
+      <w:pPr>
+        <w:rPr>
+          <w:rFonts w:ascii="Segoe UI Emoji" w:hAnsi="Segoe UI Emoji" w:cs="Segoe UI Emoji"/>
+        </w:rPr>
+      </w:pPr>
+      <w:r>
+        <w:rPr>
+          <w:rFonts w:ascii="Segoe UI Emoji" w:hAnsi="Segoe UI Emoji" w:cs="Segoe UI Emoji"/>
+        </w:rPr>
+        <w:t>🎉</w:t>
+      </w:r>
+      <w:r>
+        <w:t xml:space="preserve">¡Felicitaciones por la entrega del Desafío 01! </w:t>
+      </w:r>
+      <w:r>
+        <w:rPr>
+          <w:rFonts w:ascii="Segoe UI Emoji" w:hAnsi="Segoe UI Emoji" w:cs="Segoe UI Emoji"/>
+        </w:rPr>
+        <w:t>🎉</w:t>
+      </w:r>
+    </w:p>
+    <w:p/>
+    <w:p>
+      <w:r>
+        <w:t>Primeramente, quería felicitarte por el trabajo que realizaste. El resultado renderizado es el solicitado.</w:t>
+      </w:r>
+    </w:p>
+    <w:p/>
+    <w:p>
+      <w:r>
+        <w:t xml:space="preserve">Respetaste el orden de aplicación de uso de etiquetas de encabezado (h1, h2, etc..) y el manejo de etiquetas para textos es correcto. </w:t>
       </w:r>
     </w:p>
     <w:p/>
@@ -3807,16 +3764,6 @@
       </w:r>
     </w:p>
     <w:p/>
-    <w:p>
-      <w:pPr>
-        <w:pStyle w:val="Prrafodelista"/>
-      </w:pPr>
-    </w:p>
-    <w:p>
-      <w:pPr>
-        <w:pStyle w:val="Prrafodelista"/>
-      </w:pPr>
-    </w:p>
     <w:p>
       <w:pPr>
         <w:pStyle w:val="Prrafodelista"/>
@@ -3827,59 +3774,27 @@
       </w:pPr>
       <w:proofErr w:type="spellStart"/>
       <w:r>
-        <w:t>Recorda</w:t>
-      </w:r>
-      <w:proofErr w:type="spellEnd"/>
-      <w:r>
-        <w:t xml:space="preserve"> que la etiqueta &lt;</w:t>
-      </w:r>
-      <w:proofErr w:type="spellStart"/>
-      <w:r>
-        <w:t>strong</w:t>
-      </w:r>
-      <w:proofErr w:type="spellEnd"/>
-      <w:r>
-        <w:t xml:space="preserve">&gt; </w:t>
-      </w:r>
-      <w:proofErr w:type="gramStart"/>
-      <w:r>
-        <w:t>le</w:t>
-      </w:r>
-      <w:proofErr w:type="gramEnd"/>
-      <w:r>
-        <w:t xml:space="preserve"> dice a los motores de búsqueda que esa </w:t>
-      </w:r>
-      <w:proofErr w:type="spellStart"/>
-      <w:r>
-        <w:t>info</w:t>
-      </w:r>
-      <w:proofErr w:type="spellEnd"/>
-      <w:r>
-        <w:t xml:space="preserve"> es importante, por lo cual es recomendable utilizarla con recaudo. Por </w:t>
-      </w:r>
-      <w:proofErr w:type="gramStart"/>
-      <w:r>
-        <w:t>ejemplo</w:t>
-      </w:r>
-      <w:proofErr w:type="gramEnd"/>
-      <w:r>
-        <w:t xml:space="preserve"> en la parte del significado del término FODA que la primer letra del </w:t>
-      </w:r>
-      <w:proofErr w:type="spellStart"/>
-      <w:r>
-        <w:t>item</w:t>
-      </w:r>
-      <w:proofErr w:type="spellEnd"/>
-      <w:r>
-        <w:t xml:space="preserve"> va en negrita podes utilizar en lugar de &lt;</w:t>
-      </w:r>
-      <w:proofErr w:type="spellStart"/>
-      <w:r>
-        <w:t>strong</w:t>
-      </w:r>
-      <w:proofErr w:type="spellEnd"/>
-      <w:r>
-        <w:t>&gt; la etiqueta &lt;b&gt; que pone en negrita la letra pero con un fin más que todo de estética visual para el usuario, te quedaría así:</w:t>
+        <w:t>Recordá</w:t>
+      </w:r>
+      <w:proofErr w:type="spellEnd"/>
+      <w:r>
+        <w:t xml:space="preserve"> cambiar el lenguaje a español &lt;</w:t>
+      </w:r>
+      <w:proofErr w:type="spellStart"/>
+      <w:r>
+        <w:t>html</w:t>
+      </w:r>
+      <w:proofErr w:type="spellEnd"/>
+      <w:r>
+        <w:t xml:space="preserve"> </w:t>
+      </w:r>
+      <w:proofErr w:type="spellStart"/>
+      <w:r>
+        <w:t>lang</w:t>
+      </w:r>
+      <w:proofErr w:type="spellEnd"/>
+      <w:r>
+        <w:t>="es"&gt; porque esto le dice a los motores de búsqueda en que idioma esta tu sitio web.</w:t>
       </w:r>
     </w:p>
     <w:p>
@@ -3890,295 +3805,8 @@
     <w:p>
       <w:pPr>
         <w:pStyle w:val="Prrafodelista"/>
-        <w:ind w:left="2124"/>
-      </w:pPr>
-      <w:r>
-        <w:t>&lt;</w:t>
-      </w:r>
-      <w:proofErr w:type="spellStart"/>
-      <w:r>
-        <w:t>ul</w:t>
-      </w:r>
-      <w:proofErr w:type="spellEnd"/>
-      <w:r>
-        <w:t>&gt;</w:t>
-      </w:r>
-    </w:p>
-    <w:p>
-      <w:pPr>
-        <w:pStyle w:val="Prrafodelista"/>
-        <w:ind w:left="2124"/>
-      </w:pPr>
-      <w:r>
-        <w:t>    &lt;</w:t>
-      </w:r>
-      <w:proofErr w:type="spellStart"/>
-      <w:r>
-        <w:t>li</w:t>
-      </w:r>
-      <w:proofErr w:type="spellEnd"/>
-      <w:r>
-        <w:t>&gt;&lt;b&gt;F&lt;/b&gt;</w:t>
-      </w:r>
-      <w:proofErr w:type="spellStart"/>
-      <w:r>
-        <w:t>ortalezas</w:t>
-      </w:r>
-      <w:proofErr w:type="spellEnd"/>
-      <w:r>
-        <w:t>&lt;/</w:t>
-      </w:r>
-      <w:proofErr w:type="spellStart"/>
-      <w:r>
-        <w:t>li</w:t>
-      </w:r>
-      <w:proofErr w:type="spellEnd"/>
-      <w:r>
-        <w:t>&gt;</w:t>
-      </w:r>
-    </w:p>
-    <w:p>
-      <w:pPr>
-        <w:pStyle w:val="Prrafodelista"/>
-        <w:ind w:left="2124"/>
-      </w:pPr>
-      <w:r>
-        <w:t>    &lt;</w:t>
-      </w:r>
-      <w:proofErr w:type="spellStart"/>
-      <w:r>
-        <w:t>li</w:t>
-      </w:r>
-      <w:proofErr w:type="spellEnd"/>
-      <w:r>
-        <w:t>&gt;&lt;b&gt;O&lt;/b&gt;</w:t>
-      </w:r>
-      <w:proofErr w:type="spellStart"/>
-      <w:r>
-        <w:t>bjetivos</w:t>
-      </w:r>
-      <w:proofErr w:type="spellEnd"/>
-      <w:r>
-        <w:t>&lt;/</w:t>
-      </w:r>
-      <w:proofErr w:type="spellStart"/>
-      <w:r>
-        <w:t>li</w:t>
-      </w:r>
-      <w:proofErr w:type="spellEnd"/>
-      <w:r>
-        <w:t>&gt;</w:t>
-      </w:r>
-    </w:p>
-    <w:p>
-      <w:pPr>
-        <w:pStyle w:val="Prrafodelista"/>
-        <w:ind w:left="2124"/>
-      </w:pPr>
-      <w:r>
-        <w:t>    &lt;</w:t>
-      </w:r>
-      <w:proofErr w:type="spellStart"/>
-      <w:r>
-        <w:t>li</w:t>
-      </w:r>
-      <w:proofErr w:type="spellEnd"/>
-      <w:r>
-        <w:t>&gt;&lt;b&gt;D&lt;/b&gt;</w:t>
-      </w:r>
-      <w:proofErr w:type="spellStart"/>
-      <w:r>
-        <w:t>ebilidades</w:t>
-      </w:r>
-      <w:proofErr w:type="spellEnd"/>
-      <w:r>
-        <w:t>&lt;/</w:t>
-      </w:r>
-      <w:proofErr w:type="spellStart"/>
-      <w:r>
-        <w:t>li</w:t>
-      </w:r>
-      <w:proofErr w:type="spellEnd"/>
-      <w:r>
-        <w:t>&gt;</w:t>
-      </w:r>
-    </w:p>
-    <w:p>
-      <w:pPr>
-        <w:pStyle w:val="Prrafodelista"/>
-        <w:ind w:left="2124"/>
-      </w:pPr>
-      <w:r>
-        <w:t>    &lt;</w:t>
-      </w:r>
-      <w:proofErr w:type="spellStart"/>
-      <w:r>
-        <w:t>li</w:t>
-      </w:r>
-      <w:proofErr w:type="spellEnd"/>
-      <w:r>
-        <w:t>&gt;&lt;b&gt;A&lt;/b&gt;menazas&lt;/</w:t>
-      </w:r>
-      <w:proofErr w:type="spellStart"/>
-      <w:r>
-        <w:t>li</w:t>
-      </w:r>
-      <w:proofErr w:type="spellEnd"/>
-      <w:r>
-        <w:t>&gt;  </w:t>
-      </w:r>
-    </w:p>
-    <w:p>
-      <w:pPr>
-        <w:pStyle w:val="Prrafodelista"/>
-        <w:ind w:left="2124"/>
-      </w:pPr>
-      <w:r>
-        <w:t>&lt;/</w:t>
-      </w:r>
-      <w:proofErr w:type="spellStart"/>
-      <w:r>
-        <w:t>ul</w:t>
-      </w:r>
-      <w:proofErr w:type="spellEnd"/>
-      <w:r>
-        <w:t>&gt;</w:t>
-      </w:r>
-    </w:p>
-    <w:p>
-      <w:pPr>
-        <w:pStyle w:val="Prrafodelista"/>
-        <w:ind w:left="2124"/>
-      </w:pPr>
-    </w:p>
-    <w:p/>
-    <w:p>
-      <w:pPr>
-        <w:pStyle w:val="Prrafodelista"/>
-        <w:ind w:left="1440"/>
-      </w:pPr>
-    </w:p>
-    <w:p/>
-    <w:p>
-      <w:r>
-        <w:t>Muy buen trabajo ¡</w:t>
-      </w:r>
-    </w:p>
-    <w:p/>
-    <w:p>
-      <w:r>
-        <w:t xml:space="preserve">Tu nota en el Desafío 01 es: </w:t>
-      </w:r>
-      <w:r>
-        <w:rPr>
-          <w:b/>
-          <w:bCs/>
-        </w:rPr>
-        <w:t>10</w:t>
-      </w:r>
-    </w:p>
-    <w:p/>
-    <w:p>
-      <w:pPr>
-        <w:pBdr>
-          <w:bottom w:val="single" w:sz="6" w:space="1" w:color="auto"/>
-        </w:pBdr>
-      </w:pPr>
-    </w:p>
-    <w:p/>
-    <w:p>
-      <w:pPr>
-        <w:rPr>
-          <w:rFonts w:ascii="Segoe UI Emoji" w:hAnsi="Segoe UI Emoji" w:cs="Segoe UI Emoji"/>
-          <w:b/>
-          <w:bCs/>
-        </w:rPr>
-      </w:pPr>
-      <w:r>
-        <w:rPr>
-          <w:rFonts w:ascii="Segoe UI Emoji" w:hAnsi="Segoe UI Emoji" w:cs="Segoe UI Emoji"/>
-          <w:b/>
-          <w:bCs/>
-        </w:rPr>
-        <w:t>Galeano Jason</w:t>
-      </w:r>
-    </w:p>
-    <w:p>
-      <w:pPr>
-        <w:rPr>
-          <w:rFonts w:ascii="Segoe UI Emoji" w:hAnsi="Segoe UI Emoji" w:cs="Segoe UI Emoji"/>
-          <w:b/>
-          <w:bCs/>
-        </w:rPr>
-      </w:pPr>
-    </w:p>
-    <w:p>
-      <w:pPr>
-        <w:rPr>
-          <w:rFonts w:ascii="Segoe UI Emoji" w:hAnsi="Segoe UI Emoji" w:cs="Segoe UI Emoji"/>
-        </w:rPr>
-      </w:pPr>
-      <w:proofErr w:type="gramStart"/>
-      <w:r>
-        <w:rPr>
-          <w:rFonts w:ascii="Segoe UI Emoji" w:hAnsi="Segoe UI Emoji" w:cs="Segoe UI Emoji"/>
-        </w:rPr>
-        <w:lastRenderedPageBreak/>
-        <w:t>🎉</w:t>
-      </w:r>
-      <w:r>
-        <w:t>¡</w:t>
-      </w:r>
-      <w:proofErr w:type="gramEnd"/>
-      <w:r>
-        <w:t xml:space="preserve">Felicitaciones por la entrega del Desafío 01! </w:t>
-      </w:r>
-      <w:r>
-        <w:rPr>
-          <w:rFonts w:ascii="Segoe UI Emoji" w:hAnsi="Segoe UI Emoji" w:cs="Segoe UI Emoji"/>
-        </w:rPr>
-        <w:t>🎉</w:t>
-      </w:r>
-    </w:p>
-    <w:p/>
-    <w:p>
-      <w:r>
-        <w:t xml:space="preserve">Primeramente, quería felicitarte por el trabajo que realizaste. El resultado renderizado y </w:t>
-      </w:r>
-      <w:r>
-        <w:t>el</w:t>
-      </w:r>
-      <w:r>
-        <w:t xml:space="preserve"> código impecables.</w:t>
-      </w:r>
-    </w:p>
-    <w:p/>
-    <w:p>
-      <w:r>
-        <w:t xml:space="preserve">Respetaste el orden de aplicación de uso de etiquetas de encabezado (h1, h2, etc..) y el manejo de etiquetas para textos es correcto. </w:t>
-      </w:r>
-    </w:p>
-    <w:p/>
-    <w:p>
-      <w:r>
-        <w:t>Buenísimo que hayas diferenciado cuando usar etiquetas &lt;</w:t>
-      </w:r>
-      <w:proofErr w:type="spellStart"/>
-      <w:r>
-        <w:t>strong</w:t>
-      </w:r>
-      <w:proofErr w:type="spellEnd"/>
-      <w:r>
-        <w:t>&gt; y &lt;b&gt;</w:t>
-      </w:r>
-    </w:p>
-    <w:p/>
-    <w:p>
-      <w:r>
-        <w:t>Observaciones a tu trabajo son:</w:t>
-      </w:r>
-    </w:p>
-    <w:p/>
+      </w:pPr>
+    </w:p>
     <w:p>
       <w:pPr>
         <w:pStyle w:val="Prrafodelista"/>
@@ -4187,163 +3815,207 @@
           <w:numId w:val="1"/>
         </w:numPr>
       </w:pPr>
-      <w:proofErr w:type="spellStart"/>
-      <w:r>
-        <w:t>Recordá</w:t>
-      </w:r>
-      <w:proofErr w:type="spellEnd"/>
-      <w:r>
-        <w:t xml:space="preserve"> cambiar el lenguaje a español &lt;</w:t>
-      </w:r>
-      <w:proofErr w:type="spellStart"/>
-      <w:r>
-        <w:t>html</w:t>
-      </w:r>
-      <w:proofErr w:type="spellEnd"/>
-      <w:r>
-        <w:t xml:space="preserve"> </w:t>
-      </w:r>
-      <w:proofErr w:type="spellStart"/>
-      <w:r>
-        <w:t>lang</w:t>
-      </w:r>
-      <w:proofErr w:type="spellEnd"/>
-      <w:r>
-        <w:t xml:space="preserve">="es"&gt; porque esto </w:t>
-      </w:r>
-      <w:proofErr w:type="gramStart"/>
-      <w:r>
-        <w:t>le</w:t>
-      </w:r>
-      <w:proofErr w:type="gramEnd"/>
-      <w:r>
-        <w:t xml:space="preserve"> dice a los motores de búsqueda en que idioma esta tu sitio web.</w:t>
+      <w:r>
+        <w:t xml:space="preserve">En la parte del significado del término FODA que la primer letra del </w:t>
+      </w:r>
+      <w:proofErr w:type="spellStart"/>
+      <w:r>
+        <w:t>item</w:t>
+      </w:r>
+      <w:proofErr w:type="spellEnd"/>
+      <w:r>
+        <w:t xml:space="preserve"> va en negrita </w:t>
+      </w:r>
+      <w:proofErr w:type="spellStart"/>
+      <w:r>
+        <w:t>podias</w:t>
+      </w:r>
+      <w:proofErr w:type="spellEnd"/>
+      <w:r>
+        <w:t xml:space="preserve"> utilizar la etiqueta &lt;b&gt; que pone en negrita la letra pero con un fin más que todo de estética visual para el usuario, te quedaría así:</w:t>
       </w:r>
     </w:p>
     <w:p>
       <w:pPr>
         <w:pStyle w:val="Prrafodelista"/>
-        <w:ind w:left="1440"/>
-      </w:pPr>
-    </w:p>
-    <w:p/>
-    <w:p>
-      <w:r>
-        <w:t>Excelente trabajo ¡</w:t>
-      </w:r>
-    </w:p>
-    <w:p/>
-    <w:p>
-      <w:r>
-        <w:t xml:space="preserve">Tu nota en el Desafío 01 es: </w:t>
-      </w:r>
-      <w:r>
-        <w:rPr>
-          <w:b/>
-          <w:bCs/>
-        </w:rPr>
-        <w:t>10</w:t>
-      </w:r>
-    </w:p>
-    <w:p>
-      <w:pPr>
-        <w:pBdr>
-          <w:bottom w:val="single" w:sz="6" w:space="1" w:color="auto"/>
-        </w:pBdr>
-      </w:pPr>
-    </w:p>
-    <w:p>
-      <w:pPr>
-        <w:pBdr>
-          <w:bottom w:val="single" w:sz="6" w:space="1" w:color="auto"/>
-        </w:pBdr>
-      </w:pPr>
-    </w:p>
-    <w:p/>
-    <w:p>
-      <w:pPr>
-        <w:rPr>
-          <w:rFonts w:ascii="Segoe UI Emoji" w:hAnsi="Segoe UI Emoji" w:cs="Segoe UI Emoji"/>
-          <w:b/>
-          <w:bCs/>
-        </w:rPr>
-      </w:pPr>
-      <w:r>
-        <w:rPr>
-          <w:rFonts w:ascii="Segoe UI Emoji" w:hAnsi="Segoe UI Emoji" w:cs="Segoe UI Emoji"/>
-          <w:b/>
-          <w:bCs/>
-        </w:rPr>
-        <w:t xml:space="preserve">Core </w:t>
-      </w:r>
-      <w:proofErr w:type="spellStart"/>
-      <w:r>
-        <w:rPr>
-          <w:rFonts w:ascii="Segoe UI Emoji" w:hAnsi="Segoe UI Emoji" w:cs="Segoe UI Emoji"/>
-          <w:b/>
-          <w:bCs/>
-        </w:rPr>
-        <w:t>Maximo</w:t>
-      </w:r>
-      <w:proofErr w:type="spellEnd"/>
-    </w:p>
-    <w:p>
-      <w:pPr>
-        <w:rPr>
-          <w:rFonts w:ascii="Segoe UI Emoji" w:hAnsi="Segoe UI Emoji" w:cs="Segoe UI Emoji"/>
-          <w:b/>
-          <w:bCs/>
-        </w:rPr>
-      </w:pPr>
-    </w:p>
-    <w:p>
-      <w:pPr>
-        <w:rPr>
-          <w:rFonts w:ascii="Segoe UI Emoji" w:hAnsi="Segoe UI Emoji" w:cs="Segoe UI Emoji"/>
-        </w:rPr>
-      </w:pPr>
-      <w:proofErr w:type="gramStart"/>
-      <w:r>
-        <w:rPr>
-          <w:rFonts w:ascii="Segoe UI Emoji" w:hAnsi="Segoe UI Emoji" w:cs="Segoe UI Emoji"/>
-        </w:rPr>
-        <w:t>🎉</w:t>
-      </w:r>
-      <w:r>
-        <w:t>¡</w:t>
-      </w:r>
-      <w:proofErr w:type="gramEnd"/>
-      <w:r>
-        <w:t xml:space="preserve">Felicitaciones por la entrega del Desafío 01! </w:t>
-      </w:r>
-      <w:r>
-        <w:rPr>
-          <w:rFonts w:ascii="Segoe UI Emoji" w:hAnsi="Segoe UI Emoji" w:cs="Segoe UI Emoji"/>
-        </w:rPr>
-        <w:t>🎉</w:t>
-      </w:r>
-    </w:p>
-    <w:p/>
-    <w:p>
-      <w:r>
-        <w:t>Primeramente, quería felicitarte por el trabajo que realizaste. El resultado renderizado es el solicitado.</w:t>
-      </w:r>
-    </w:p>
-    <w:p/>
-    <w:p>
-      <w:r>
-        <w:t xml:space="preserve">Respetaste el orden de aplicación de uso de etiquetas de encabezado (h1, h2, etc..) y el manejo de etiquetas para textos es correcto. </w:t>
-      </w:r>
-    </w:p>
-    <w:p/>
-    <w:p/>
-    <w:p>
-      <w:r>
-        <w:lastRenderedPageBreak/>
-        <w:t>Observaciones a tu trabajo son:</w:t>
-      </w:r>
-    </w:p>
-    <w:p/>
+      </w:pPr>
+    </w:p>
+    <w:p>
+      <w:pPr>
+        <w:pStyle w:val="Prrafodelista"/>
+        <w:ind w:left="2124"/>
+      </w:pPr>
+      <w:r>
+        <w:t>&lt;</w:t>
+      </w:r>
+      <w:proofErr w:type="spellStart"/>
+      <w:r>
+        <w:t>ul</w:t>
+      </w:r>
+      <w:proofErr w:type="spellEnd"/>
+      <w:r>
+        <w:t>&gt;</w:t>
+      </w:r>
+    </w:p>
+    <w:p>
+      <w:pPr>
+        <w:pStyle w:val="Prrafodelista"/>
+        <w:ind w:left="2124"/>
+      </w:pPr>
+      <w:r>
+        <w:t>    &lt;</w:t>
+      </w:r>
+      <w:proofErr w:type="spellStart"/>
+      <w:r>
+        <w:t>li</w:t>
+      </w:r>
+      <w:proofErr w:type="spellEnd"/>
+      <w:r>
+        <w:t>&gt;&lt;b&gt;F&lt;/b&gt;</w:t>
+      </w:r>
+      <w:proofErr w:type="spellStart"/>
+      <w:r>
+        <w:t>ortalezas</w:t>
+      </w:r>
+      <w:proofErr w:type="spellEnd"/>
+      <w:r>
+        <w:t>&lt;/</w:t>
+      </w:r>
+      <w:proofErr w:type="spellStart"/>
+      <w:r>
+        <w:t>li</w:t>
+      </w:r>
+      <w:proofErr w:type="spellEnd"/>
+      <w:r>
+        <w:t>&gt;</w:t>
+      </w:r>
+    </w:p>
+    <w:p>
+      <w:pPr>
+        <w:pStyle w:val="Prrafodelista"/>
+        <w:ind w:left="2124"/>
+      </w:pPr>
+      <w:r>
+        <w:t>    &lt;</w:t>
+      </w:r>
+      <w:proofErr w:type="spellStart"/>
+      <w:r>
+        <w:t>li</w:t>
+      </w:r>
+      <w:proofErr w:type="spellEnd"/>
+      <w:r>
+        <w:t>&gt;&lt;b&gt;O&lt;/b&gt;</w:t>
+      </w:r>
+      <w:proofErr w:type="spellStart"/>
+      <w:r>
+        <w:t>bjetivos</w:t>
+      </w:r>
+      <w:proofErr w:type="spellEnd"/>
+      <w:r>
+        <w:t>&lt;/</w:t>
+      </w:r>
+      <w:proofErr w:type="spellStart"/>
+      <w:r>
+        <w:t>li</w:t>
+      </w:r>
+      <w:proofErr w:type="spellEnd"/>
+      <w:r>
+        <w:t>&gt;</w:t>
+      </w:r>
+    </w:p>
+    <w:p>
+      <w:pPr>
+        <w:pStyle w:val="Prrafodelista"/>
+        <w:ind w:left="2124"/>
+      </w:pPr>
+      <w:r>
+        <w:t>    &lt;</w:t>
+      </w:r>
+      <w:proofErr w:type="spellStart"/>
+      <w:r>
+        <w:t>li</w:t>
+      </w:r>
+      <w:proofErr w:type="spellEnd"/>
+      <w:r>
+        <w:t>&gt;&lt;b&gt;D&lt;/b&gt;</w:t>
+      </w:r>
+      <w:proofErr w:type="spellStart"/>
+      <w:r>
+        <w:t>ebilidades</w:t>
+      </w:r>
+      <w:proofErr w:type="spellEnd"/>
+      <w:r>
+        <w:t>&lt;/</w:t>
+      </w:r>
+      <w:proofErr w:type="spellStart"/>
+      <w:r>
+        <w:t>li</w:t>
+      </w:r>
+      <w:proofErr w:type="spellEnd"/>
+      <w:r>
+        <w:t>&gt;</w:t>
+      </w:r>
+    </w:p>
+    <w:p>
+      <w:pPr>
+        <w:pStyle w:val="Prrafodelista"/>
+        <w:ind w:left="2124"/>
+      </w:pPr>
+      <w:r>
+        <w:t>    &lt;</w:t>
+      </w:r>
+      <w:proofErr w:type="spellStart"/>
+      <w:r>
+        <w:t>li</w:t>
+      </w:r>
+      <w:proofErr w:type="spellEnd"/>
+      <w:r>
+        <w:t>&gt;&lt;b&gt;A&lt;/b&gt;menazas&lt;/</w:t>
+      </w:r>
+      <w:proofErr w:type="spellStart"/>
+      <w:r>
+        <w:t>li</w:t>
+      </w:r>
+      <w:proofErr w:type="spellEnd"/>
+      <w:r>
+        <w:t>&gt;  </w:t>
+      </w:r>
+    </w:p>
+    <w:p>
+      <w:pPr>
+        <w:pStyle w:val="Prrafodelista"/>
+        <w:ind w:left="2124"/>
+      </w:pPr>
+      <w:r>
+        <w:t>&lt;/</w:t>
+      </w:r>
+      <w:proofErr w:type="spellStart"/>
+      <w:r>
+        <w:t>ul</w:t>
+      </w:r>
+      <w:proofErr w:type="spellEnd"/>
+      <w:r>
+        <w:t>&gt;</w:t>
+      </w:r>
+    </w:p>
+    <w:p>
+      <w:pPr>
+        <w:pStyle w:val="Prrafodelista"/>
+        <w:ind w:left="2124"/>
+      </w:pPr>
+    </w:p>
+    <w:p>
+      <w:pPr>
+        <w:pStyle w:val="Prrafodelista"/>
+        <w:ind w:left="2124"/>
+      </w:pPr>
+    </w:p>
+    <w:p>
+      <w:pPr>
+        <w:pStyle w:val="Prrafodelista"/>
+        <w:ind w:left="2124"/>
+      </w:pPr>
+    </w:p>
     <w:p>
       <w:pPr>
         <w:pStyle w:val="Prrafodelista"/>
@@ -4352,274 +4024,6 @@
           <w:numId w:val="1"/>
         </w:numPr>
       </w:pPr>
-      <w:proofErr w:type="spellStart"/>
-      <w:r>
-        <w:t>Recordá</w:t>
-      </w:r>
-      <w:proofErr w:type="spellEnd"/>
-      <w:r>
-        <w:t xml:space="preserve"> cambiar el lenguaje a español &lt;</w:t>
-      </w:r>
-      <w:proofErr w:type="spellStart"/>
-      <w:r>
-        <w:t>html</w:t>
-      </w:r>
-      <w:proofErr w:type="spellEnd"/>
-      <w:r>
-        <w:t xml:space="preserve"> </w:t>
-      </w:r>
-      <w:proofErr w:type="spellStart"/>
-      <w:r>
-        <w:t>lang</w:t>
-      </w:r>
-      <w:proofErr w:type="spellEnd"/>
-      <w:r>
-        <w:t xml:space="preserve">="es"&gt; porque esto </w:t>
-      </w:r>
-      <w:proofErr w:type="gramStart"/>
-      <w:r>
-        <w:t>le</w:t>
-      </w:r>
-      <w:proofErr w:type="gramEnd"/>
-      <w:r>
-        <w:t xml:space="preserve"> dice a los motores de búsqueda en que idioma esta tu sitio web.</w:t>
-      </w:r>
-    </w:p>
-    <w:p>
-      <w:pPr>
-        <w:pStyle w:val="Prrafodelista"/>
-      </w:pPr>
-    </w:p>
-    <w:p>
-      <w:pPr>
-        <w:pStyle w:val="Prrafodelista"/>
-      </w:pPr>
-    </w:p>
-    <w:p>
-      <w:pPr>
-        <w:pStyle w:val="Prrafodelista"/>
-        <w:numPr>
-          <w:ilvl w:val="0"/>
-          <w:numId w:val="1"/>
-        </w:numPr>
-      </w:pPr>
-      <w:r>
-        <w:t xml:space="preserve">En la parte del significado del término FODA que la </w:t>
-      </w:r>
-      <w:proofErr w:type="gramStart"/>
-      <w:r>
-        <w:t>primer letra</w:t>
-      </w:r>
-      <w:proofErr w:type="gramEnd"/>
-      <w:r>
-        <w:t xml:space="preserve"> del </w:t>
-      </w:r>
-      <w:proofErr w:type="spellStart"/>
-      <w:r>
-        <w:t>item</w:t>
-      </w:r>
-      <w:proofErr w:type="spellEnd"/>
-      <w:r>
-        <w:t xml:space="preserve"> va en negrita </w:t>
-      </w:r>
-      <w:proofErr w:type="spellStart"/>
-      <w:r>
-        <w:t>podias</w:t>
-      </w:r>
-      <w:proofErr w:type="spellEnd"/>
-      <w:r>
-        <w:t xml:space="preserve"> utilizar la etiqueta &lt;b&gt; que pone en negrita la letra pero con un fin más que todo de estética visual para el usuario, te quedaría así:</w:t>
-      </w:r>
-    </w:p>
-    <w:p>
-      <w:pPr>
-        <w:pStyle w:val="Prrafodelista"/>
-      </w:pPr>
-    </w:p>
-    <w:p>
-      <w:pPr>
-        <w:pStyle w:val="Prrafodelista"/>
-        <w:ind w:left="2124"/>
-      </w:pPr>
-      <w:r>
-        <w:t>&lt;</w:t>
-      </w:r>
-      <w:proofErr w:type="spellStart"/>
-      <w:r>
-        <w:t>ul</w:t>
-      </w:r>
-      <w:proofErr w:type="spellEnd"/>
-      <w:r>
-        <w:t>&gt;</w:t>
-      </w:r>
-    </w:p>
-    <w:p>
-      <w:pPr>
-        <w:pStyle w:val="Prrafodelista"/>
-        <w:ind w:left="2124"/>
-      </w:pPr>
-      <w:r>
-        <w:t>    &lt;</w:t>
-      </w:r>
-      <w:proofErr w:type="spellStart"/>
-      <w:r>
-        <w:t>li</w:t>
-      </w:r>
-      <w:proofErr w:type="spellEnd"/>
-      <w:r>
-        <w:t>&gt;&lt;b&gt;F&lt;/b&gt;</w:t>
-      </w:r>
-      <w:proofErr w:type="spellStart"/>
-      <w:r>
-        <w:t>ortalezas</w:t>
-      </w:r>
-      <w:proofErr w:type="spellEnd"/>
-      <w:r>
-        <w:t>&lt;/</w:t>
-      </w:r>
-      <w:proofErr w:type="spellStart"/>
-      <w:r>
-        <w:t>li</w:t>
-      </w:r>
-      <w:proofErr w:type="spellEnd"/>
-      <w:r>
-        <w:t>&gt;</w:t>
-      </w:r>
-    </w:p>
-    <w:p>
-      <w:pPr>
-        <w:pStyle w:val="Prrafodelista"/>
-        <w:ind w:left="2124"/>
-      </w:pPr>
-      <w:r>
-        <w:t>    &lt;</w:t>
-      </w:r>
-      <w:proofErr w:type="spellStart"/>
-      <w:r>
-        <w:t>li</w:t>
-      </w:r>
-      <w:proofErr w:type="spellEnd"/>
-      <w:r>
-        <w:t>&gt;&lt;b&gt;O&lt;/b&gt;</w:t>
-      </w:r>
-      <w:proofErr w:type="spellStart"/>
-      <w:r>
-        <w:t>bjetivos</w:t>
-      </w:r>
-      <w:proofErr w:type="spellEnd"/>
-      <w:r>
-        <w:t>&lt;/</w:t>
-      </w:r>
-      <w:proofErr w:type="spellStart"/>
-      <w:r>
-        <w:t>li</w:t>
-      </w:r>
-      <w:proofErr w:type="spellEnd"/>
-      <w:r>
-        <w:t>&gt;</w:t>
-      </w:r>
-    </w:p>
-    <w:p>
-      <w:pPr>
-        <w:pStyle w:val="Prrafodelista"/>
-        <w:ind w:left="2124"/>
-      </w:pPr>
-      <w:r>
-        <w:t>    &lt;</w:t>
-      </w:r>
-      <w:proofErr w:type="spellStart"/>
-      <w:r>
-        <w:t>li</w:t>
-      </w:r>
-      <w:proofErr w:type="spellEnd"/>
-      <w:r>
-        <w:t>&gt;&lt;b&gt;D&lt;/b&gt;</w:t>
-      </w:r>
-      <w:proofErr w:type="spellStart"/>
-      <w:r>
-        <w:t>ebilidades</w:t>
-      </w:r>
-      <w:proofErr w:type="spellEnd"/>
-      <w:r>
-        <w:t>&lt;/</w:t>
-      </w:r>
-      <w:proofErr w:type="spellStart"/>
-      <w:r>
-        <w:t>li</w:t>
-      </w:r>
-      <w:proofErr w:type="spellEnd"/>
-      <w:r>
-        <w:t>&gt;</w:t>
-      </w:r>
-    </w:p>
-    <w:p>
-      <w:pPr>
-        <w:pStyle w:val="Prrafodelista"/>
-        <w:ind w:left="2124"/>
-      </w:pPr>
-      <w:r>
-        <w:t>    &lt;</w:t>
-      </w:r>
-      <w:proofErr w:type="spellStart"/>
-      <w:r>
-        <w:t>li</w:t>
-      </w:r>
-      <w:proofErr w:type="spellEnd"/>
-      <w:r>
-        <w:t>&gt;&lt;b&gt;A&lt;/b&gt;menazas&lt;/</w:t>
-      </w:r>
-      <w:proofErr w:type="spellStart"/>
-      <w:r>
-        <w:t>li</w:t>
-      </w:r>
-      <w:proofErr w:type="spellEnd"/>
-      <w:r>
-        <w:t>&gt;  </w:t>
-      </w:r>
-    </w:p>
-    <w:p>
-      <w:pPr>
-        <w:pStyle w:val="Prrafodelista"/>
-        <w:ind w:left="2124"/>
-      </w:pPr>
-      <w:r>
-        <w:t>&lt;/</w:t>
-      </w:r>
-      <w:proofErr w:type="spellStart"/>
-      <w:r>
-        <w:t>ul</w:t>
-      </w:r>
-      <w:proofErr w:type="spellEnd"/>
-      <w:r>
-        <w:t>&gt;</w:t>
-      </w:r>
-    </w:p>
-    <w:p>
-      <w:pPr>
-        <w:pStyle w:val="Prrafodelista"/>
-        <w:ind w:left="2124"/>
-      </w:pPr>
-    </w:p>
-    <w:p>
-      <w:pPr>
-        <w:pStyle w:val="Prrafodelista"/>
-        <w:ind w:left="2124"/>
-      </w:pPr>
-    </w:p>
-    <w:p>
-      <w:pPr>
-        <w:pStyle w:val="Prrafodelista"/>
-        <w:ind w:left="2124"/>
-      </w:pPr>
-    </w:p>
-    <w:p>
-      <w:pPr>
-        <w:pStyle w:val="Prrafodelista"/>
-        <w:numPr>
-          <w:ilvl w:val="0"/>
-          <w:numId w:val="1"/>
-        </w:numPr>
-      </w:pPr>
       <w:r>
         <w:t xml:space="preserve">Falto usar la etiqueta </w:t>
       </w:r>
@@ -4629,15 +4033,7 @@
       </w:r>
       <w:proofErr w:type="spellEnd"/>
       <w:r>
-        <w:t xml:space="preserve"> en algún texto para darle énfasis de manera que los motores de búsqueda lo tomen en cuenta, por </w:t>
-      </w:r>
-      <w:proofErr w:type="gramStart"/>
-      <w:r>
-        <w:t>ejemplo</w:t>
-      </w:r>
-      <w:proofErr w:type="gramEnd"/>
-      <w:r>
-        <w:t xml:space="preserve"> podías enfatizar el </w:t>
+        <w:t xml:space="preserve"> en algún texto para darle énfasis de manera que los motores de búsqueda lo tomen en cuenta, por ejemplo podías enfatizar el </w:t>
       </w:r>
       <w:proofErr w:type="spellStart"/>
       <w:r>

</xml_diff>

<commit_message>
Correccion Desafio 02 - Terminado hasta Zuñiga
</commit_message>
<xml_diff>
--- a/Practicos/Notas y Devoluciones 01.docx
+++ b/Practicos/Notas y Devoluciones 01.docx
@@ -1,6 +1,6 @@
 
 <file path=word/document.xml><?xml version="1.0" encoding="utf-8"?>
-<w:document xmlns:wpc="http://schemas.microsoft.com/office/word/2010/wordprocessingCanvas" xmlns:cx="http://schemas.microsoft.com/office/drawing/2014/chartex" xmlns:cx1="http://schemas.microsoft.com/office/drawing/2015/9/8/chartex" xmlns:cx2="http://schemas.microsoft.com/office/drawing/2015/10/21/chartex" xmlns:cx3="http://schemas.microsoft.com/office/drawing/2016/5/9/chartex" xmlns:cx4="http://schemas.microsoft.com/office/drawing/2016/5/10/chartex" xmlns:cx5="http://schemas.microsoft.com/office/drawing/2016/5/11/chartex" xmlns:cx6="http://schemas.microsoft.com/office/drawing/2016/5/12/chartex" xmlns:cx7="http://schemas.microsoft.com/office/drawing/2016/5/13/chartex" xmlns:cx8="http://schemas.microsoft.com/office/drawing/2016/5/14/chartex" xmlns:mc="http://schemas.openxmlformats.org/markup-compatibility/2006" xmlns:aink="http://schemas.microsoft.com/office/drawing/2016/ink" xmlns:am3d="http://schemas.microsoft.com/office/drawing/2017/model3d" xmlns:o="urn:schemas-microsoft-com:office:office" xmlns:r="http://schemas.openxmlformats.org/officeDocument/2006/relationships" xmlns:m="http://schemas.openxmlformats.org/officeDocument/2006/math" xmlns:v="urn:schemas-microsoft-com:vml" xmlns:wp14="http://schemas.microsoft.com/office/word/2010/wordprocessingDrawing" xmlns:wp="http://schemas.openxmlformats.org/drawingml/2006/wordprocessingDrawing" xmlns:w10="urn:schemas-microsoft-com:office:word" xmlns:w="http://schemas.openxmlformats.org/wordprocessingml/2006/main" xmlns:w14="http://schemas.microsoft.com/office/word/2010/wordml" xmlns:w15="http://schemas.microsoft.com/office/word/2012/wordml" xmlns:w16cex="http://schemas.microsoft.com/office/word/2018/wordml/cex" xmlns:w16cid="http://schemas.microsoft.com/office/word/2016/wordml/cid" xmlns:w16="http://schemas.microsoft.com/office/word/2018/wordml" xmlns:w16sdtdh="http://schemas.microsoft.com/office/word/2020/wordml/sdtdatahash" xmlns:w16se="http://schemas.microsoft.com/office/word/2015/wordml/symex" xmlns:wpg="http://schemas.microsoft.com/office/word/2010/wordprocessingGroup" xmlns:wpi="http://schemas.microsoft.com/office/word/2010/wordprocessingInk" xmlns:wne="http://schemas.microsoft.com/office/word/2006/wordml" xmlns:wps="http://schemas.microsoft.com/office/word/2010/wordprocessingShape" mc:Ignorable="w14 w15 w16se w16cid w16 w16cex w16sdtdh wp14">
+<w:document xmlns:wpc="http://schemas.microsoft.com/office/word/2010/wordprocessingCanvas" xmlns:cx="http://schemas.microsoft.com/office/drawing/2014/chartex" xmlns:cx1="http://schemas.microsoft.com/office/drawing/2015/9/8/chartex" xmlns:cx2="http://schemas.microsoft.com/office/drawing/2015/10/21/chartex" xmlns:cx3="http://schemas.microsoft.com/office/drawing/2016/5/9/chartex" xmlns:cx4="http://schemas.microsoft.com/office/drawing/2016/5/10/chartex" xmlns:cx5="http://schemas.microsoft.com/office/drawing/2016/5/11/chartex" xmlns:cx6="http://schemas.microsoft.com/office/drawing/2016/5/12/chartex" xmlns:cx7="http://schemas.microsoft.com/office/drawing/2016/5/13/chartex" xmlns:cx8="http://schemas.microsoft.com/office/drawing/2016/5/14/chartex" xmlns:mc="http://schemas.openxmlformats.org/markup-compatibility/2006" xmlns:aink="http://schemas.microsoft.com/office/drawing/2016/ink" xmlns:am3d="http://schemas.microsoft.com/office/drawing/2017/model3d" xmlns:o="urn:schemas-microsoft-com:office:office" xmlns:oel="http://schemas.microsoft.com/office/2019/extlst" xmlns:r="http://schemas.openxmlformats.org/officeDocument/2006/relationships" xmlns:m="http://schemas.openxmlformats.org/officeDocument/2006/math" xmlns:v="urn:schemas-microsoft-com:vml" xmlns:wp14="http://schemas.microsoft.com/office/word/2010/wordprocessingDrawing" xmlns:wp="http://schemas.openxmlformats.org/drawingml/2006/wordprocessingDrawing" xmlns:w10="urn:schemas-microsoft-com:office:word" xmlns:w="http://schemas.openxmlformats.org/wordprocessingml/2006/main" xmlns:w14="http://schemas.microsoft.com/office/word/2010/wordml" xmlns:w15="http://schemas.microsoft.com/office/word/2012/wordml" xmlns:w16cex="http://schemas.microsoft.com/office/word/2018/wordml/cex" xmlns:w16cid="http://schemas.microsoft.com/office/word/2016/wordml/cid" xmlns:w16="http://schemas.microsoft.com/office/word/2018/wordml" xmlns:w16du="http://schemas.microsoft.com/office/word/2023/wordml/word16du" xmlns:w16sdtdh="http://schemas.microsoft.com/office/word/2020/wordml/sdtdatahash" xmlns:w16sdtfl="http://schemas.microsoft.com/office/word/2024/wordml/sdtformatlock" xmlns:w16se="http://schemas.microsoft.com/office/word/2015/wordml/symex" xmlns:wpg="http://schemas.microsoft.com/office/word/2010/wordprocessingGroup" xmlns:wpi="http://schemas.microsoft.com/office/word/2010/wordprocessingInk" xmlns:wne="http://schemas.microsoft.com/office/word/2006/wordml" xmlns:wps="http://schemas.microsoft.com/office/word/2010/wordprocessingShape" mc:Ignorable="w14 w15 w16se w16cid w16 w16cex w16sdtdh w16sdtfl w16du wp14">
   <w:body>
     <w:p>
       <w:pPr>
@@ -77,15 +77,7 @@
     <w:p/>
     <w:p>
       <w:r>
-        <w:t>Buenísimo que hayas diferenciado cuando usar etiquetas &lt;</w:t>
-      </w:r>
-      <w:proofErr w:type="spellStart"/>
-      <w:r>
-        <w:t>strong</w:t>
-      </w:r>
-      <w:proofErr w:type="spellEnd"/>
-      <w:r>
-        <w:t>&gt; y &lt;b&gt;</w:t>
+        <w:t>Buenísimo que hayas diferenciado cuando usar etiquetas &lt;strong&gt; y &lt;b&gt;</w:t>
       </w:r>
       <w:r>
         <w:t xml:space="preserve"> </w:t>
@@ -140,18 +132,8 @@
           <w:b/>
           <w:bCs/>
         </w:rPr>
-        <w:t xml:space="preserve">González Diego </w:t>
-      </w:r>
-      <w:proofErr w:type="spellStart"/>
-      <w:r>
-        <w:rPr>
-          <w:rFonts w:ascii="Segoe UI Emoji" w:hAnsi="Segoe UI Emoji" w:cs="Segoe UI Emoji"/>
-          <w:b/>
-          <w:bCs/>
-        </w:rPr>
-        <w:t>Gaston</w:t>
-      </w:r>
-      <w:proofErr w:type="spellEnd"/>
+        <w:t>González Diego Gaston</w:t>
+      </w:r>
     </w:p>
     <w:p>
       <w:pPr>
@@ -206,15 +188,7 @@
     <w:p/>
     <w:p>
       <w:r>
-        <w:t>Buenísimo que hayas diferenciado cuando usar etiquetas &lt;</w:t>
-      </w:r>
-      <w:proofErr w:type="spellStart"/>
-      <w:r>
-        <w:t>strong</w:t>
-      </w:r>
-      <w:proofErr w:type="spellEnd"/>
-      <w:r>
-        <w:t xml:space="preserve">&gt; y &lt;b&gt; </w:t>
+        <w:t xml:space="preserve">Buenísimo que hayas diferenciado cuando usar etiquetas &lt;strong&gt; y &lt;b&gt; </w:t>
       </w:r>
     </w:p>
     <w:p/>
@@ -254,73 +228,51 @@
           <w:u w:val="single"/>
         </w:rPr>
       </w:pPr>
-      <w:proofErr w:type="spellStart"/>
-      <w:r>
-        <w:rPr>
-          <w:rFonts w:ascii="Segoe UI Emoji" w:hAnsi="Segoe UI Emoji" w:cs="Segoe UI Emoji"/>
-          <w:b/>
-          <w:bCs/>
-        </w:rPr>
-        <w:t>Albarracin</w:t>
-      </w:r>
-      <w:proofErr w:type="spellEnd"/>
-      <w:r>
-        <w:rPr>
-          <w:rFonts w:ascii="Segoe UI Emoji" w:hAnsi="Segoe UI Emoji" w:cs="Segoe UI Emoji"/>
-          <w:b/>
-          <w:bCs/>
-        </w:rPr>
-        <w:t xml:space="preserve"> </w:t>
-      </w:r>
-      <w:proofErr w:type="spellStart"/>
-      <w:r>
-        <w:rPr>
-          <w:rFonts w:ascii="Segoe UI Emoji" w:hAnsi="Segoe UI Emoji" w:cs="Segoe UI Emoji"/>
-          <w:b/>
-          <w:bCs/>
-        </w:rPr>
+      <w:r>
+        <w:rPr>
+          <w:rFonts w:ascii="Segoe UI Emoji" w:hAnsi="Segoe UI Emoji" w:cs="Segoe UI Emoji"/>
+          <w:b/>
+          <w:bCs/>
+        </w:rPr>
+        <w:t>Albarracin Agustin</w:t>
+      </w:r>
+    </w:p>
+    <w:p>
+      <w:pPr>
+        <w:rPr>
+          <w:rFonts w:ascii="Segoe UI Emoji" w:hAnsi="Segoe UI Emoji" w:cs="Segoe UI Emoji"/>
+          <w:b/>
+          <w:bCs/>
+        </w:rPr>
+      </w:pPr>
+    </w:p>
+    <w:p>
+      <w:pPr>
+        <w:rPr>
+          <w:rFonts w:ascii="Segoe UI Emoji" w:hAnsi="Segoe UI Emoji" w:cs="Segoe UI Emoji"/>
+        </w:rPr>
+      </w:pPr>
+      <w:r>
+        <w:rPr>
+          <w:rFonts w:ascii="Segoe UI Emoji" w:hAnsi="Segoe UI Emoji" w:cs="Segoe UI Emoji"/>
+        </w:rPr>
+        <w:t>🎉</w:t>
+      </w:r>
+      <w:r>
+        <w:t xml:space="preserve">¡Felicitaciones por la entrega del Desafío 01! </w:t>
+      </w:r>
+      <w:r>
+        <w:rPr>
+          <w:rFonts w:ascii="Segoe UI Emoji" w:hAnsi="Segoe UI Emoji" w:cs="Segoe UI Emoji"/>
+        </w:rPr>
+        <w:t>🎉</w:t>
+      </w:r>
+    </w:p>
+    <w:p/>
+    <w:p>
+      <w:r>
         <w:t>Agustin</w:t>
       </w:r>
-      <w:proofErr w:type="spellEnd"/>
-    </w:p>
-    <w:p>
-      <w:pPr>
-        <w:rPr>
-          <w:rFonts w:ascii="Segoe UI Emoji" w:hAnsi="Segoe UI Emoji" w:cs="Segoe UI Emoji"/>
-          <w:b/>
-          <w:bCs/>
-        </w:rPr>
-      </w:pPr>
-    </w:p>
-    <w:p>
-      <w:pPr>
-        <w:rPr>
-          <w:rFonts w:ascii="Segoe UI Emoji" w:hAnsi="Segoe UI Emoji" w:cs="Segoe UI Emoji"/>
-        </w:rPr>
-      </w:pPr>
-      <w:r>
-        <w:rPr>
-          <w:rFonts w:ascii="Segoe UI Emoji" w:hAnsi="Segoe UI Emoji" w:cs="Segoe UI Emoji"/>
-        </w:rPr>
-        <w:t>🎉</w:t>
-      </w:r>
-      <w:r>
-        <w:t xml:space="preserve">¡Felicitaciones por la entrega del Desafío 01! </w:t>
-      </w:r>
-      <w:r>
-        <w:rPr>
-          <w:rFonts w:ascii="Segoe UI Emoji" w:hAnsi="Segoe UI Emoji" w:cs="Segoe UI Emoji"/>
-        </w:rPr>
-        <w:t>🎉</w:t>
-      </w:r>
-    </w:p>
-    <w:p/>
-    <w:p>
-      <w:proofErr w:type="spellStart"/>
-      <w:r>
-        <w:t>Agustin</w:t>
-      </w:r>
-      <w:proofErr w:type="spellEnd"/>
       <w:r>
         <w:t>, quería felicitarte por el trabajo que realizaste. El resultado renderizado es el solicitado.</w:t>
       </w:r>
@@ -340,100 +292,28 @@
     <w:p/>
     <w:p>
       <w:r>
-        <w:t>Buenísimo que hayas diferenciado cuando usar etiquetas &lt;</w:t>
-      </w:r>
-      <w:proofErr w:type="spellStart"/>
-      <w:r>
-        <w:t>strong</w:t>
-      </w:r>
-      <w:proofErr w:type="spellEnd"/>
-      <w:r>
-        <w:t>&gt; y &lt;b&gt;</w:t>
-      </w:r>
-      <w:r>
-        <w:t xml:space="preserve">, acá capaz podías marcar algunas palabras claves </w:t>
-      </w:r>
-      <w:proofErr w:type="spellStart"/>
-      <w:r>
-        <w:t>mas</w:t>
-      </w:r>
-      <w:proofErr w:type="spellEnd"/>
-      <w:r>
-        <w:t xml:space="preserve"> con la etiqueta &lt;</w:t>
-      </w:r>
-      <w:proofErr w:type="spellStart"/>
-      <w:r>
-        <w:t>strong</w:t>
-      </w:r>
-      <w:proofErr w:type="spellEnd"/>
-      <w:r>
-        <w:t>&gt;</w:t>
-      </w:r>
-    </w:p>
-    <w:p/>
-    <w:p>
-      <w:r>
-        <w:t>Las listas &lt;</w:t>
-      </w:r>
-      <w:proofErr w:type="spellStart"/>
-      <w:r>
-        <w:t>ol</w:t>
-      </w:r>
-      <w:proofErr w:type="spellEnd"/>
-      <w:r>
-        <w:t>&gt; y &lt;</w:t>
-      </w:r>
-      <w:proofErr w:type="spellStart"/>
-      <w:r>
-        <w:t>ul</w:t>
-      </w:r>
-      <w:proofErr w:type="spellEnd"/>
-      <w:r>
-        <w:t xml:space="preserve">&gt; quedaron ok, no hace falta agregar el atributo </w:t>
-      </w:r>
-      <w:proofErr w:type="spellStart"/>
-      <w:r>
-        <w:t>type</w:t>
-      </w:r>
-      <w:proofErr w:type="spellEnd"/>
-      <w:r>
-        <w:t xml:space="preserve"> en estos casos, ya por default vienen como los necesitábamos.</w:t>
+        <w:t>Buenísimo que hayas diferenciado cuando usar etiquetas &lt;strong&gt; y &lt;b&gt;</w:t>
+      </w:r>
+      <w:r>
+        <w:t>, acá capaz podías marcar algunas palabras claves mas con la etiqueta &lt;strong&gt;</w:t>
+      </w:r>
+    </w:p>
+    <w:p/>
+    <w:p>
+      <w:r>
+        <w:t>Las listas &lt;ol&gt; y &lt;ul&gt; quedaron ok, no hace falta agregar el atributo type en estos casos, ya por default vienen como los necesitábamos.</w:t>
       </w:r>
     </w:p>
     <w:p/>
     <w:p>
       <w:r>
         <w:tab/>
-        <w:t>&lt;</w:t>
-      </w:r>
-      <w:proofErr w:type="spellStart"/>
-      <w:r>
-        <w:t>ol</w:t>
-      </w:r>
-      <w:proofErr w:type="spellEnd"/>
-      <w:r>
-        <w:t>&gt;</w:t>
-      </w:r>
-    </w:p>
-    <w:p>
-      <w:r>
-        <w:t xml:space="preserve">                   &lt;</w:t>
-      </w:r>
-      <w:proofErr w:type="spellStart"/>
-      <w:r>
-        <w:t>li</w:t>
-      </w:r>
-      <w:proofErr w:type="spellEnd"/>
-      <w:r>
-        <w:t>&gt;&lt;b&gt;HTML, CSS y JavaScript:&lt;/b&gt; fundamentos del desarrollo web.&lt;/</w:t>
-      </w:r>
-      <w:proofErr w:type="spellStart"/>
-      <w:r>
-        <w:t>li</w:t>
-      </w:r>
-      <w:proofErr w:type="spellEnd"/>
-      <w:r>
-        <w:t>&gt;</w:t>
+        <w:t>&lt;ol&gt;</w:t>
+      </w:r>
+    </w:p>
+    <w:p>
+      <w:r>
+        <w:t xml:space="preserve">                   &lt;li&gt;&lt;b&gt;HTML, CSS y JavaScript:&lt;/b&gt; fundamentos del desarrollo web.&lt;/li&gt;</w:t>
       </w:r>
     </w:p>
     <w:p>
@@ -452,57 +332,20 @@
     </w:p>
     <w:p>
       <w:r>
-        <w:t xml:space="preserve">                &lt;</w:t>
-      </w:r>
-      <w:proofErr w:type="spellStart"/>
-      <w:r>
-        <w:t>li</w:t>
-      </w:r>
-      <w:proofErr w:type="spellEnd"/>
-      <w:r>
-        <w:t>&gt;&lt;b&gt;Control de versiones:&lt;/b&gt; Git y GitHub.&lt;/</w:t>
-      </w:r>
-      <w:proofErr w:type="spellStart"/>
-      <w:r>
-        <w:t>li</w:t>
-      </w:r>
-      <w:proofErr w:type="spellEnd"/>
-      <w:r>
-        <w:t>&gt;</w:t>
-      </w:r>
-    </w:p>
-    <w:p>
-      <w:r>
-        <w:t xml:space="preserve">        &lt;/</w:t>
-      </w:r>
-      <w:proofErr w:type="spellStart"/>
-      <w:r>
-        <w:t>ol</w:t>
-      </w:r>
-      <w:proofErr w:type="spellEnd"/>
-      <w:r>
-        <w:t>&gt;</w:t>
-      </w:r>
-    </w:p>
-    <w:p/>
-    <w:p/>
-    <w:p>
-      <w:r>
-        <w:t xml:space="preserve">Podes utilizar el atajo en el teclado para darle formato al documento y que quede </w:t>
-      </w:r>
-      <w:proofErr w:type="spellStart"/>
-      <w:r>
-        <w:t>mas</w:t>
-      </w:r>
-      <w:proofErr w:type="spellEnd"/>
-      <w:r>
-        <w:t xml:space="preserve"> ordenado con las teclas: </w:t>
-      </w:r>
-      <w:proofErr w:type="spellStart"/>
-      <w:r>
-        <w:t>Alt+Shift+f</w:t>
-      </w:r>
-      <w:proofErr w:type="spellEnd"/>
+        <w:t xml:space="preserve">                &lt;li&gt;&lt;b&gt;Control de versiones:&lt;/b&gt; Git y GitHub.&lt;/li&gt;</w:t>
+      </w:r>
+    </w:p>
+    <w:p>
+      <w:r>
+        <w:t xml:space="preserve">        &lt;/ol&gt;</w:t>
+      </w:r>
+    </w:p>
+    <w:p/>
+    <w:p/>
+    <w:p>
+      <w:r>
+        <w:t>Podes utilizar el atajo en el teclado para darle formato al documento y que quede mas ordenado con las teclas: Alt+Shift+f</w:t>
+      </w:r>
     </w:p>
     <w:p/>
     <w:p/>
@@ -636,15 +479,7 @@
     <w:p/>
     <w:p>
       <w:r>
-        <w:t>Buenísimo que hayas diferenciado cuando usar etiquetas &lt;</w:t>
-      </w:r>
-      <w:proofErr w:type="spellStart"/>
-      <w:r>
-        <w:t>strong</w:t>
-      </w:r>
-      <w:proofErr w:type="spellEnd"/>
-      <w:r>
-        <w:t xml:space="preserve">&gt; y &lt;b&gt; </w:t>
+        <w:t xml:space="preserve">Buenísimo que hayas diferenciado cuando usar etiquetas &lt;strong&gt; y &lt;b&gt; </w:t>
       </w:r>
     </w:p>
     <w:p/>
@@ -696,25 +531,7 @@
           <w:b/>
           <w:bCs/>
         </w:rPr>
-        <w:t xml:space="preserve">Figueroa Maidana </w:t>
-      </w:r>
-      <w:proofErr w:type="spellStart"/>
-      <w:r>
-        <w:rPr>
-          <w:rFonts w:ascii="Segoe UI Emoji" w:hAnsi="Segoe UI Emoji" w:cs="Segoe UI Emoji"/>
-          <w:b/>
-          <w:bCs/>
-        </w:rPr>
-        <w:t>Belen</w:t>
-      </w:r>
-      <w:proofErr w:type="spellEnd"/>
-      <w:r>
-        <w:rPr>
-          <w:rFonts w:ascii="Segoe UI Emoji" w:hAnsi="Segoe UI Emoji" w:cs="Segoe UI Emoji"/>
-          <w:b/>
-          <w:bCs/>
-        </w:rPr>
-        <w:t xml:space="preserve"> </w:t>
+        <w:t xml:space="preserve">Figueroa Maidana Belen </w:t>
       </w:r>
       <w:r>
         <w:rPr>
@@ -759,15 +576,7 @@
     <w:p/>
     <w:p>
       <w:r>
-        <w:t xml:space="preserve">Hola </w:t>
-      </w:r>
-      <w:proofErr w:type="spellStart"/>
-      <w:r>
-        <w:t>Belen</w:t>
-      </w:r>
-      <w:proofErr w:type="spellEnd"/>
-      <w:r>
-        <w:t>, quería felicitarte por el trabajo que realizaste. El resultado renderizado es el solicitado.</w:t>
+        <w:t>Hola Belen, quería felicitarte por el trabajo que realizaste. El resultado renderizado es el solicitado.</w:t>
       </w:r>
     </w:p>
     <w:p/>
@@ -791,63 +600,7 @@
     <w:p/>
     <w:p>
       <w:r>
-        <w:t>Recaudo con el uso de la etiqueta &lt;</w:t>
-      </w:r>
-      <w:proofErr w:type="spellStart"/>
-      <w:r>
-        <w:t>strong</w:t>
-      </w:r>
-      <w:proofErr w:type="spellEnd"/>
-      <w:r>
-        <w:t xml:space="preserve">&gt;, </w:t>
-      </w:r>
-      <w:proofErr w:type="spellStart"/>
-      <w:r>
-        <w:t>recorda</w:t>
-      </w:r>
-      <w:proofErr w:type="spellEnd"/>
-      <w:r>
-        <w:t xml:space="preserve"> que le dice a los motores de búsqueda que esa </w:t>
-      </w:r>
-      <w:proofErr w:type="spellStart"/>
-      <w:r>
-        <w:t>info</w:t>
-      </w:r>
-      <w:proofErr w:type="spellEnd"/>
-      <w:r>
-        <w:t xml:space="preserve"> es importante y que la tome en cuenta cuando imprime los resultados de </w:t>
-      </w:r>
-      <w:proofErr w:type="spellStart"/>
-      <w:r>
-        <w:t>busqueda</w:t>
-      </w:r>
-      <w:proofErr w:type="spellEnd"/>
-      <w:r>
-        <w:t xml:space="preserve">, por lo cual es recomendable utilizarla con recaudo. Por ejemplo en la parte del significado del término MERN que la primer letra del </w:t>
-      </w:r>
-      <w:proofErr w:type="spellStart"/>
-      <w:r>
-        <w:t>item</w:t>
-      </w:r>
-      <w:proofErr w:type="spellEnd"/>
-      <w:r>
-        <w:t xml:space="preserve"> va en negrita podes utilizar en lugar de &lt;</w:t>
-      </w:r>
-      <w:proofErr w:type="spellStart"/>
-      <w:r>
-        <w:t>strong</w:t>
-      </w:r>
-      <w:proofErr w:type="spellEnd"/>
-      <w:r>
-        <w:t xml:space="preserve">&gt; la etiqueta &lt;b&gt; que pone en negrita la letra pero con un fin </w:t>
-      </w:r>
-      <w:proofErr w:type="spellStart"/>
-      <w:r>
-        <w:t>mas</w:t>
-      </w:r>
-      <w:proofErr w:type="spellEnd"/>
-      <w:r>
-        <w:t xml:space="preserve"> que todo de estética visual para el usuario.</w:t>
+        <w:t>Recaudo con el uso de la etiqueta &lt;strong&gt;, recorda que le dice a los motores de búsqueda que esa info es importante y que la tome en cuenta cuando imprime los resultados de busqueda, por lo cual es recomendable utilizarla con recaudo. Por ejemplo en la parte del significado del término MERN que la primer letra del item va en negrita podes utilizar en lugar de &lt;strong&gt; la etiqueta &lt;b&gt; que pone en negrita la letra pero con un fin mas que todo de estética visual para el usuario.</w:t>
       </w:r>
     </w:p>
     <w:p/>
@@ -901,83 +654,45 @@
           <w:bCs/>
         </w:rPr>
         <w:lastRenderedPageBreak/>
-        <w:t xml:space="preserve">Segovia </w:t>
-      </w:r>
-      <w:proofErr w:type="spellStart"/>
-      <w:r>
-        <w:rPr>
-          <w:rFonts w:ascii="Segoe UI Emoji" w:hAnsi="Segoe UI Emoji" w:cs="Segoe UI Emoji"/>
-          <w:b/>
-          <w:bCs/>
-        </w:rPr>
-        <w:t>Rodriguez</w:t>
-      </w:r>
-      <w:proofErr w:type="spellEnd"/>
-      <w:r>
-        <w:rPr>
-          <w:rFonts w:ascii="Segoe UI Emoji" w:hAnsi="Segoe UI Emoji" w:cs="Segoe UI Emoji"/>
-          <w:b/>
-          <w:bCs/>
-        </w:rPr>
-        <w:t xml:space="preserve"> </w:t>
-      </w:r>
-      <w:proofErr w:type="spellStart"/>
-      <w:r>
-        <w:rPr>
-          <w:rFonts w:ascii="Segoe UI Emoji" w:hAnsi="Segoe UI Emoji" w:cs="Segoe UI Emoji"/>
-          <w:b/>
-          <w:bCs/>
-        </w:rPr>
+        <w:t>Segovia Rodriguez Estefani Lujan</w:t>
+      </w:r>
+    </w:p>
+    <w:p>
+      <w:pPr>
+        <w:rPr>
+          <w:rFonts w:ascii="Segoe UI Emoji" w:hAnsi="Segoe UI Emoji" w:cs="Segoe UI Emoji"/>
+          <w:b/>
+          <w:bCs/>
+        </w:rPr>
+      </w:pPr>
+    </w:p>
+    <w:p>
+      <w:pPr>
+        <w:rPr>
+          <w:rFonts w:ascii="Segoe UI Emoji" w:hAnsi="Segoe UI Emoji" w:cs="Segoe UI Emoji"/>
+        </w:rPr>
+      </w:pPr>
+      <w:r>
+        <w:rPr>
+          <w:rFonts w:ascii="Segoe UI Emoji" w:hAnsi="Segoe UI Emoji" w:cs="Segoe UI Emoji"/>
+        </w:rPr>
+        <w:t>🎉</w:t>
+      </w:r>
+      <w:r>
+        <w:t xml:space="preserve">¡Felicitaciones por la entrega del Desafío 01! </w:t>
+      </w:r>
+      <w:r>
+        <w:rPr>
+          <w:rFonts w:ascii="Segoe UI Emoji" w:hAnsi="Segoe UI Emoji" w:cs="Segoe UI Emoji"/>
+        </w:rPr>
+        <w:t>🎉</w:t>
+      </w:r>
+    </w:p>
+    <w:p/>
+    <w:p>
+      <w:r>
         <w:t>Estefani</w:t>
       </w:r>
-      <w:proofErr w:type="spellEnd"/>
-      <w:r>
-        <w:rPr>
-          <w:rFonts w:ascii="Segoe UI Emoji" w:hAnsi="Segoe UI Emoji" w:cs="Segoe UI Emoji"/>
-          <w:b/>
-          <w:bCs/>
-        </w:rPr>
-        <w:t xml:space="preserve"> Lujan</w:t>
-      </w:r>
-    </w:p>
-    <w:p>
-      <w:pPr>
-        <w:rPr>
-          <w:rFonts w:ascii="Segoe UI Emoji" w:hAnsi="Segoe UI Emoji" w:cs="Segoe UI Emoji"/>
-          <w:b/>
-          <w:bCs/>
-        </w:rPr>
-      </w:pPr>
-    </w:p>
-    <w:p>
-      <w:pPr>
-        <w:rPr>
-          <w:rFonts w:ascii="Segoe UI Emoji" w:hAnsi="Segoe UI Emoji" w:cs="Segoe UI Emoji"/>
-        </w:rPr>
-      </w:pPr>
-      <w:r>
-        <w:rPr>
-          <w:rFonts w:ascii="Segoe UI Emoji" w:hAnsi="Segoe UI Emoji" w:cs="Segoe UI Emoji"/>
-        </w:rPr>
-        <w:t>🎉</w:t>
-      </w:r>
-      <w:r>
-        <w:t xml:space="preserve">¡Felicitaciones por la entrega del Desafío 01! </w:t>
-      </w:r>
-      <w:r>
-        <w:rPr>
-          <w:rFonts w:ascii="Segoe UI Emoji" w:hAnsi="Segoe UI Emoji" w:cs="Segoe UI Emoji"/>
-        </w:rPr>
-        <w:t>🎉</w:t>
-      </w:r>
-    </w:p>
-    <w:p/>
-    <w:p>
-      <w:proofErr w:type="spellStart"/>
-      <w:r>
-        <w:t>Estefani</w:t>
-      </w:r>
-      <w:proofErr w:type="spellEnd"/>
       <w:r>
         <w:t>, primeramente, quería felicitarte por el trabajo que realizaste. El resultado renderizado es el solicitado.</w:t>
       </w:r>
@@ -988,21 +703,8 @@
         <w:t>Destaco la correcta estructura del documento HTML</w:t>
       </w:r>
       <w:r>
-        <w:t xml:space="preserve">. Podes utilizar el atajo en el teclado para darle formato al documento y que quede </w:t>
-      </w:r>
-      <w:proofErr w:type="spellStart"/>
-      <w:r>
-        <w:t>mas</w:t>
-      </w:r>
-      <w:proofErr w:type="spellEnd"/>
-      <w:r>
-        <w:t xml:space="preserve"> ordenado con las teclas: </w:t>
-      </w:r>
-      <w:proofErr w:type="spellStart"/>
-      <w:r>
-        <w:t>Alt+Shift+f</w:t>
-      </w:r>
-      <w:proofErr w:type="spellEnd"/>
+        <w:t>. Podes utilizar el atajo en el teclado para darle formato al documento y que quede mas ordenado con las teclas: Alt+Shift+f</w:t>
+      </w:r>
     </w:p>
     <w:p/>
     <w:p/>
@@ -1014,42 +716,13 @@
     <w:p/>
     <w:p>
       <w:r>
-        <w:t>Buenísimo que hayas diferenciado cuando usar etiquetas &lt;</w:t>
-      </w:r>
-      <w:proofErr w:type="spellStart"/>
-      <w:r>
-        <w:t>strong</w:t>
-      </w:r>
-      <w:proofErr w:type="spellEnd"/>
-      <w:r>
-        <w:t xml:space="preserve">&gt; y &lt;b&gt; </w:t>
-      </w:r>
-    </w:p>
-    <w:p/>
-    <w:p>
-      <w:proofErr w:type="spellStart"/>
-      <w:r>
-        <w:t>Recorda</w:t>
-      </w:r>
-      <w:proofErr w:type="spellEnd"/>
-      <w:r>
-        <w:t xml:space="preserve"> cambiar el lenguaje a español &lt;</w:t>
-      </w:r>
-      <w:proofErr w:type="spellStart"/>
-      <w:r>
-        <w:t>html</w:t>
-      </w:r>
-      <w:proofErr w:type="spellEnd"/>
-      <w:r>
-        <w:t xml:space="preserve"> </w:t>
-      </w:r>
-      <w:proofErr w:type="spellStart"/>
-      <w:r>
-        <w:t>lang</w:t>
-      </w:r>
-      <w:proofErr w:type="spellEnd"/>
-      <w:r>
-        <w:t>="es"&gt; porque esto le dice a los motores de búsqueda en que idioma esta tu sitio web.</w:t>
+        <w:t xml:space="preserve">Buenísimo que hayas diferenciado cuando usar etiquetas &lt;strong&gt; y &lt;b&gt; </w:t>
+      </w:r>
+    </w:p>
+    <w:p/>
+    <w:p>
+      <w:r>
+        <w:t>Recorda cambiar el lenguaje a español &lt;html lang="es"&gt; porque esto le dice a los motores de búsqueda en que idioma esta tu sitio web.</w:t>
       </w:r>
     </w:p>
     <w:p/>
@@ -1157,13 +830,8 @@
         <w:t>más</w:t>
       </w:r>
       <w:r>
-        <w:t xml:space="preserve"> ordenado con las teclas: </w:t>
-      </w:r>
-      <w:proofErr w:type="spellStart"/>
-      <w:r>
-        <w:t>Alt+Shift+f</w:t>
-      </w:r>
-      <w:proofErr w:type="spellEnd"/>
+        <w:t xml:space="preserve"> ordenado con las teclas: Alt+Shift+f</w:t>
+      </w:r>
     </w:p>
     <w:p/>
     <w:p>
@@ -1174,42 +842,13 @@
     <w:p/>
     <w:p>
       <w:r>
-        <w:t>Buenísimo que hayas diferenciado cuando usar etiquetas &lt;</w:t>
-      </w:r>
-      <w:proofErr w:type="spellStart"/>
-      <w:r>
-        <w:t>strong</w:t>
-      </w:r>
-      <w:proofErr w:type="spellEnd"/>
-      <w:r>
-        <w:t xml:space="preserve">&gt; y &lt;b&gt; </w:t>
-      </w:r>
-    </w:p>
-    <w:p/>
-    <w:p>
-      <w:proofErr w:type="spellStart"/>
-      <w:r>
-        <w:t>Recorda</w:t>
-      </w:r>
-      <w:proofErr w:type="spellEnd"/>
-      <w:r>
-        <w:t xml:space="preserve"> cambiar el lenguaje a español &lt;</w:t>
-      </w:r>
-      <w:proofErr w:type="spellStart"/>
-      <w:r>
-        <w:t>html</w:t>
-      </w:r>
-      <w:proofErr w:type="spellEnd"/>
-      <w:r>
-        <w:t xml:space="preserve"> </w:t>
-      </w:r>
-      <w:proofErr w:type="spellStart"/>
-      <w:r>
-        <w:t>lang</w:t>
-      </w:r>
-      <w:proofErr w:type="spellEnd"/>
-      <w:r>
-        <w:t>="es"&gt; porque esto le dice a los motores de búsqueda en que idioma esta tu sitio web.</w:t>
+        <w:t xml:space="preserve">Buenísimo que hayas diferenciado cuando usar etiquetas &lt;strong&gt; y &lt;b&gt; </w:t>
+      </w:r>
+    </w:p>
+    <w:p/>
+    <w:p>
+      <w:r>
+        <w:t>Recorda cambiar el lenguaje a español &lt;html lang="es"&gt; porque esto le dice a los motores de búsqueda en que idioma esta tu sitio web.</w:t>
       </w:r>
     </w:p>
     <w:p/>
@@ -1220,47 +859,7 @@
         </w:rPr>
       </w:pPr>
       <w:r>
-        <w:t>Utilizaste contenedores &lt;</w:t>
-      </w:r>
-      <w:proofErr w:type="spellStart"/>
-      <w:r>
-        <w:t>div</w:t>
-      </w:r>
-      <w:proofErr w:type="spellEnd"/>
-      <w:r>
-        <w:t xml:space="preserve">&gt; en lugar de &lt;p&gt; en algunas partes, esto visualmente da el mismo resultado, pero semánticamente seria </w:t>
-      </w:r>
-      <w:proofErr w:type="spellStart"/>
-      <w:r>
-        <w:t>mas</w:t>
-      </w:r>
-      <w:proofErr w:type="spellEnd"/>
-      <w:r>
-        <w:t xml:space="preserve"> correcto usar &lt;p&gt; para ese contenido. La etiqueta &lt;</w:t>
-      </w:r>
-      <w:proofErr w:type="spellStart"/>
-      <w:r>
-        <w:t>div</w:t>
-      </w:r>
-      <w:proofErr w:type="spellEnd"/>
-      <w:r>
-        <w:t xml:space="preserve">&gt; la vamos a utilizar </w:t>
-      </w:r>
-      <w:proofErr w:type="spellStart"/>
-      <w:r>
-        <w:t>mas</w:t>
-      </w:r>
-      <w:proofErr w:type="spellEnd"/>
-      <w:r>
-        <w:t xml:space="preserve"> como un genérico cuando no </w:t>
-      </w:r>
-      <w:proofErr w:type="spellStart"/>
-      <w:r>
-        <w:t>esta</w:t>
-      </w:r>
-      <w:proofErr w:type="spellEnd"/>
-      <w:r>
-        <w:t xml:space="preserve"> bien definido el tipo de contenido que vamos a encerrar o cuando es por algún fin estético.</w:t>
+        <w:t>Utilizaste contenedores &lt;div&gt; en lugar de &lt;p&gt; en algunas partes, esto visualmente da el mismo resultado, pero semánticamente seria mas correcto usar &lt;p&gt; para ese contenido. La etiqueta &lt;div&gt; la vamos a utilizar mas como un genérico cuando no esta bien definido el tipo de contenido que vamos a encerrar o cuando es por algún fin estético.</w:t>
       </w:r>
     </w:p>
     <w:p/>
@@ -1300,23 +899,13 @@
           <w:bCs/>
         </w:rPr>
       </w:pPr>
-      <w:proofErr w:type="spellStart"/>
-      <w:r>
-        <w:rPr>
-          <w:rFonts w:ascii="Segoe UI Emoji" w:hAnsi="Segoe UI Emoji" w:cs="Segoe UI Emoji"/>
-          <w:b/>
-          <w:bCs/>
-        </w:rPr>
-        <w:t>Chiapello</w:t>
-      </w:r>
-      <w:proofErr w:type="spellEnd"/>
-      <w:r>
-        <w:rPr>
-          <w:rFonts w:ascii="Segoe UI Emoji" w:hAnsi="Segoe UI Emoji" w:cs="Segoe UI Emoji"/>
-          <w:b/>
-          <w:bCs/>
-        </w:rPr>
-        <w:t xml:space="preserve"> Gianluca</w:t>
+      <w:r>
+        <w:rPr>
+          <w:rFonts w:ascii="Segoe UI Emoji" w:hAnsi="Segoe UI Emoji" w:cs="Segoe UI Emoji"/>
+          <w:b/>
+          <w:bCs/>
+        </w:rPr>
+        <w:t>Chiapello Gianluca</w:t>
       </w:r>
     </w:p>
     <w:p>
@@ -1367,42 +956,13 @@
     <w:p/>
     <w:p>
       <w:r>
-        <w:t>Buenísimo que hayas diferenciado cuando usar etiquetas &lt;</w:t>
-      </w:r>
-      <w:proofErr w:type="spellStart"/>
-      <w:r>
-        <w:t>strong</w:t>
-      </w:r>
-      <w:proofErr w:type="spellEnd"/>
-      <w:r>
-        <w:t xml:space="preserve">&gt; y &lt;b&gt; </w:t>
-      </w:r>
-    </w:p>
-    <w:p/>
-    <w:p>
-      <w:proofErr w:type="spellStart"/>
-      <w:r>
-        <w:t>Recorda</w:t>
-      </w:r>
-      <w:proofErr w:type="spellEnd"/>
-      <w:r>
-        <w:t xml:space="preserve"> cambiar el lenguaje a español &lt;</w:t>
-      </w:r>
-      <w:proofErr w:type="spellStart"/>
-      <w:r>
-        <w:t>html</w:t>
-      </w:r>
-      <w:proofErr w:type="spellEnd"/>
-      <w:r>
-        <w:t xml:space="preserve"> </w:t>
-      </w:r>
-      <w:proofErr w:type="spellStart"/>
-      <w:r>
-        <w:t>lang</w:t>
-      </w:r>
-      <w:proofErr w:type="spellEnd"/>
-      <w:r>
-        <w:t>="es"&gt; porque esto le dice a los motores de búsqueda en que idioma esta tu sitio web.</w:t>
+        <w:t xml:space="preserve">Buenísimo que hayas diferenciado cuando usar etiquetas &lt;strong&gt; y &lt;b&gt; </w:t>
+      </w:r>
+    </w:p>
+    <w:p/>
+    <w:p>
+      <w:r>
+        <w:t>Recorda cambiar el lenguaje a español &lt;html lang="es"&gt; porque esto le dice a los motores de búsqueda en que idioma esta tu sitio web.</w:t>
       </w:r>
     </w:p>
     <w:p/>
@@ -1443,41 +1003,13 @@
           <w:bCs/>
         </w:rPr>
       </w:pPr>
-      <w:proofErr w:type="spellStart"/>
-      <w:r>
-        <w:rPr>
-          <w:rFonts w:ascii="Segoe UI Emoji" w:hAnsi="Segoe UI Emoji" w:cs="Segoe UI Emoji"/>
-          <w:b/>
-          <w:bCs/>
-        </w:rPr>
-        <w:t>Pousadas</w:t>
-      </w:r>
-      <w:proofErr w:type="spellEnd"/>
-      <w:r>
-        <w:rPr>
-          <w:rFonts w:ascii="Segoe UI Emoji" w:hAnsi="Segoe UI Emoji" w:cs="Segoe UI Emoji"/>
-          <w:b/>
-          <w:bCs/>
-        </w:rPr>
-        <w:t xml:space="preserve"> </w:t>
-      </w:r>
-      <w:proofErr w:type="spellStart"/>
-      <w:r>
-        <w:rPr>
-          <w:rFonts w:ascii="Segoe UI Emoji" w:hAnsi="Segoe UI Emoji" w:cs="Segoe UI Emoji"/>
-          <w:b/>
-          <w:bCs/>
-        </w:rPr>
-        <w:t>Bernardis</w:t>
-      </w:r>
-      <w:proofErr w:type="spellEnd"/>
-      <w:r>
-        <w:rPr>
-          <w:rFonts w:ascii="Segoe UI Emoji" w:hAnsi="Segoe UI Emoji" w:cs="Segoe UI Emoji"/>
-          <w:b/>
-          <w:bCs/>
-        </w:rPr>
-        <w:t xml:space="preserve"> </w:t>
+      <w:r>
+        <w:rPr>
+          <w:rFonts w:ascii="Segoe UI Emoji" w:hAnsi="Segoe UI Emoji" w:cs="Segoe UI Emoji"/>
+          <w:b/>
+          <w:bCs/>
+        </w:rPr>
+        <w:t xml:space="preserve">Pousadas Bernardis </w:t>
       </w:r>
       <w:r>
         <w:rPr>
@@ -1544,42 +1076,13 @@
     <w:p/>
     <w:p>
       <w:r>
-        <w:t>Buenísimo que hayas diferenciado cuando usar etiquetas &lt;</w:t>
-      </w:r>
-      <w:proofErr w:type="spellStart"/>
-      <w:r>
-        <w:t>strong</w:t>
-      </w:r>
-      <w:proofErr w:type="spellEnd"/>
-      <w:r>
-        <w:t xml:space="preserve">&gt; y &lt;b&gt; </w:t>
-      </w:r>
-    </w:p>
-    <w:p/>
-    <w:p>
-      <w:proofErr w:type="spellStart"/>
-      <w:r>
-        <w:t>Recorda</w:t>
-      </w:r>
-      <w:proofErr w:type="spellEnd"/>
-      <w:r>
-        <w:t xml:space="preserve"> cambiar el lenguaje a español &lt;</w:t>
-      </w:r>
-      <w:proofErr w:type="spellStart"/>
-      <w:r>
-        <w:t>html</w:t>
-      </w:r>
-      <w:proofErr w:type="spellEnd"/>
-      <w:r>
-        <w:t xml:space="preserve"> </w:t>
-      </w:r>
-      <w:proofErr w:type="spellStart"/>
-      <w:r>
-        <w:t>lang</w:t>
-      </w:r>
-      <w:proofErr w:type="spellEnd"/>
-      <w:r>
-        <w:t>="es"&gt; porque esto le dice a los motores de búsqueda en que idioma esta tu sitio web.</w:t>
+        <w:t xml:space="preserve">Buenísimo que hayas diferenciado cuando usar etiquetas &lt;strong&gt; y &lt;b&gt; </w:t>
+      </w:r>
+    </w:p>
+    <w:p/>
+    <w:p>
+      <w:r>
+        <w:t>Recorda cambiar el lenguaje a español &lt;html lang="es"&gt; porque esto le dice a los motores de búsqueda en que idioma esta tu sitio web.</w:t>
       </w:r>
     </w:p>
     <w:p/>
@@ -1680,83 +1183,14 @@
     </w:p>
     <w:p/>
     <w:p>
-      <w:proofErr w:type="spellStart"/>
-      <w:r>
-        <w:t>Recorda</w:t>
-      </w:r>
-      <w:proofErr w:type="spellEnd"/>
-      <w:r>
-        <w:t xml:space="preserve"> cambiar el lenguaje a español &lt;</w:t>
-      </w:r>
-      <w:proofErr w:type="spellStart"/>
-      <w:r>
-        <w:t>html</w:t>
-      </w:r>
-      <w:proofErr w:type="spellEnd"/>
-      <w:r>
-        <w:t xml:space="preserve"> </w:t>
-      </w:r>
-      <w:proofErr w:type="spellStart"/>
-      <w:r>
-        <w:t>lang</w:t>
-      </w:r>
-      <w:proofErr w:type="spellEnd"/>
-      <w:r>
-        <w:t>="es"&gt; porque esto le dice a los motores de búsqueda en que idioma esta tu sitio web.</w:t>
-      </w:r>
-    </w:p>
-    <w:p/>
-    <w:p>
-      <w:r>
-        <w:t>Recaudo con el uso de la etiqueta &lt;</w:t>
-      </w:r>
-      <w:proofErr w:type="spellStart"/>
-      <w:r>
-        <w:t>strong</w:t>
-      </w:r>
-      <w:proofErr w:type="spellEnd"/>
-      <w:r>
-        <w:t xml:space="preserve">&gt;, </w:t>
-      </w:r>
-      <w:proofErr w:type="spellStart"/>
-      <w:r>
-        <w:t>recorda</w:t>
-      </w:r>
-      <w:proofErr w:type="spellEnd"/>
-      <w:r>
-        <w:t xml:space="preserve"> que le dice a los motores de búsqueda que esa </w:t>
-      </w:r>
-      <w:proofErr w:type="spellStart"/>
-      <w:r>
-        <w:t>info</w:t>
-      </w:r>
-      <w:proofErr w:type="spellEnd"/>
-      <w:r>
-        <w:t xml:space="preserve"> es importante y que la tome en cuenta cuando imprime los resultados de búsqueda, por lo cual es recomendable utilizarla con recaudo. Por ejemplo en la parte del significado del término MERN que la primer letra del </w:t>
-      </w:r>
-      <w:proofErr w:type="spellStart"/>
-      <w:r>
-        <w:t>item</w:t>
-      </w:r>
-      <w:proofErr w:type="spellEnd"/>
-      <w:r>
-        <w:t xml:space="preserve"> va en negrita podes utilizar en lugar de &lt;</w:t>
-      </w:r>
-      <w:proofErr w:type="spellStart"/>
-      <w:r>
-        <w:t>strong</w:t>
-      </w:r>
-      <w:proofErr w:type="spellEnd"/>
-      <w:r>
-        <w:t xml:space="preserve">&gt; la etiqueta &lt;b&gt; que pone en negrita la letra pero con un fin </w:t>
-      </w:r>
-      <w:proofErr w:type="spellStart"/>
-      <w:r>
-        <w:t>mas</w:t>
-      </w:r>
-      <w:proofErr w:type="spellEnd"/>
-      <w:r>
-        <w:t xml:space="preserve"> que todo de estética visual para el usuario.</w:t>
+      <w:r>
+        <w:t>Recorda cambiar el lenguaje a español &lt;html lang="es"&gt; porque esto le dice a los motores de búsqueda en que idioma esta tu sitio web.</w:t>
+      </w:r>
+    </w:p>
+    <w:p/>
+    <w:p>
+      <w:r>
+        <w:t>Recaudo con el uso de la etiqueta &lt;strong&gt;, recorda que le dice a los motores de búsqueda que esa info es importante y que la tome en cuenta cuando imprime los resultados de búsqueda, por lo cual es recomendable utilizarla con recaudo. Por ejemplo en la parte del significado del término MERN que la primer letra del item va en negrita podes utilizar en lugar de &lt;strong&gt; la etiqueta &lt;b&gt; que pone en negrita la letra pero con un fin mas que todo de estética visual para el usuario.</w:t>
       </w:r>
     </w:p>
     <w:p/>
@@ -1799,34 +1233,14 @@
           <w:bCs/>
         </w:rPr>
       </w:pPr>
-      <w:proofErr w:type="spellStart"/>
-      <w:r>
-        <w:rPr>
-          <w:rFonts w:ascii="Segoe UI Emoji" w:hAnsi="Segoe UI Emoji" w:cs="Segoe UI Emoji"/>
-          <w:b/>
-          <w:bCs/>
-        </w:rPr>
-        <w:t>Vernengo</w:t>
-      </w:r>
-      <w:proofErr w:type="spellEnd"/>
-      <w:r>
-        <w:rPr>
-          <w:rFonts w:ascii="Segoe UI Emoji" w:hAnsi="Segoe UI Emoji" w:cs="Segoe UI Emoji"/>
-          <w:b/>
-          <w:bCs/>
-        </w:rPr>
-        <w:t xml:space="preserve"> </w:t>
-      </w:r>
-      <w:proofErr w:type="spellStart"/>
-      <w:r>
-        <w:rPr>
-          <w:rFonts w:ascii="Segoe UI Emoji" w:hAnsi="Segoe UI Emoji" w:cs="Segoe UI Emoji"/>
-          <w:b/>
-          <w:bCs/>
-        </w:rPr>
-        <w:t>Hipolito</w:t>
-      </w:r>
-      <w:proofErr w:type="spellEnd"/>
+      <w:r>
+        <w:rPr>
+          <w:rFonts w:ascii="Segoe UI Emoji" w:hAnsi="Segoe UI Emoji" w:cs="Segoe UI Emoji"/>
+          <w:b/>
+          <w:bCs/>
+        </w:rPr>
+        <w:t>Vernengo Hipolito</w:t>
+      </w:r>
     </w:p>
     <w:p>
       <w:pPr>
@@ -1862,15 +1276,7 @@
     <w:p/>
     <w:p>
       <w:r>
-        <w:t xml:space="preserve">Hola </w:t>
-      </w:r>
-      <w:proofErr w:type="spellStart"/>
-      <w:r>
-        <w:t>Hipolito</w:t>
-      </w:r>
-      <w:proofErr w:type="spellEnd"/>
-      <w:r>
-        <w:t>, quería felicitarte por el trabajo que realizaste. El resultado renderizado es el solicitado.</w:t>
+        <w:t>Hola Hipolito, quería felicitarte por el trabajo que realizaste. El resultado renderizado es el solicitado.</w:t>
       </w:r>
     </w:p>
     <w:p/>
@@ -1888,15 +1294,7 @@
     <w:p/>
     <w:p>
       <w:r>
-        <w:t>Buenísimo que hayas diferenciado cuando usar etiquetas &lt;</w:t>
-      </w:r>
-      <w:proofErr w:type="spellStart"/>
-      <w:r>
-        <w:t>strong</w:t>
-      </w:r>
-      <w:proofErr w:type="spellEnd"/>
-      <w:r>
-        <w:t xml:space="preserve">&gt; y &lt;b&gt; </w:t>
+        <w:t xml:space="preserve">Buenísimo que hayas diferenciado cuando usar etiquetas &lt;strong&gt; y &lt;b&gt; </w:t>
       </w:r>
     </w:p>
     <w:p/>
@@ -2009,51 +1407,14 @@
     </w:p>
     <w:p/>
     <w:p>
-      <w:proofErr w:type="spellStart"/>
-      <w:r>
-        <w:t>Recorda</w:t>
-      </w:r>
-      <w:proofErr w:type="spellEnd"/>
-      <w:r>
-        <w:t xml:space="preserve"> cambiar el lenguaje a español &lt;</w:t>
-      </w:r>
-      <w:proofErr w:type="spellStart"/>
-      <w:r>
-        <w:t>html</w:t>
-      </w:r>
-      <w:proofErr w:type="spellEnd"/>
-      <w:r>
-        <w:t xml:space="preserve"> </w:t>
-      </w:r>
-      <w:proofErr w:type="spellStart"/>
-      <w:r>
-        <w:t>lang</w:t>
-      </w:r>
-      <w:proofErr w:type="spellEnd"/>
-      <w:r>
-        <w:t>="es"&gt; porque esto le dice a los motores de búsqueda en que idioma esta tu sitio web.</w:t>
-      </w:r>
-    </w:p>
-    <w:p/>
-    <w:p>
-      <w:r>
-        <w:t xml:space="preserve">En la parte que describe el significado del </w:t>
-      </w:r>
-      <w:proofErr w:type="spellStart"/>
-      <w:r>
-        <w:t>termino</w:t>
-      </w:r>
-      <w:proofErr w:type="spellEnd"/>
-      <w:r>
-        <w:t xml:space="preserve"> MERN podes utilizar la etiqueta &lt;b&gt; para resaltar en negrita (un fin solo visual, </w:t>
-      </w:r>
-      <w:proofErr w:type="spellStart"/>
-      <w:r>
-        <w:t>estetico</w:t>
-      </w:r>
-      <w:proofErr w:type="spellEnd"/>
-      <w:r>
-        <w:t>):</w:t>
+      <w:r>
+        <w:t>Recorda cambiar el lenguaje a español &lt;html lang="es"&gt; porque esto le dice a los motores de búsqueda en que idioma esta tu sitio web.</w:t>
+      </w:r>
+    </w:p>
+    <w:p/>
+    <w:p>
+      <w:r>
+        <w:t>En la parte que describe el significado del termino MERN podes utilizar la etiqueta &lt;b&gt; para resaltar en negrita (un fin solo visual, estetico):</w:t>
       </w:r>
     </w:p>
     <w:p/>
@@ -2062,54 +1423,22 @@
         <w:tab/>
       </w:r>
       <w:r>
-        <w:t xml:space="preserve">    &lt;h3&gt;Tecnologías del </w:t>
-      </w:r>
-      <w:proofErr w:type="spellStart"/>
-      <w:r>
-        <w:t>Stack</w:t>
-      </w:r>
-      <w:proofErr w:type="spellEnd"/>
-      <w:r>
-        <w:t xml:space="preserve"> MERN&lt;/h3&gt;</w:t>
-      </w:r>
-    </w:p>
-    <w:p>
-      <w:r>
-        <w:t xml:space="preserve">    &lt;</w:t>
-      </w:r>
-      <w:proofErr w:type="spellStart"/>
-      <w:r>
-        <w:t>ul</w:t>
-      </w:r>
-      <w:proofErr w:type="spellEnd"/>
-      <w:r>
-        <w:t>&gt;</w:t>
-      </w:r>
-    </w:p>
-    <w:p>
-      <w:r>
-        <w:t xml:space="preserve">        &lt;</w:t>
-      </w:r>
-      <w:proofErr w:type="spellStart"/>
-      <w:r>
-        <w:t>li</w:t>
-      </w:r>
-      <w:proofErr w:type="spellEnd"/>
-      <w:r>
-        <w:t>&gt;</w:t>
-      </w:r>
-    </w:p>
-    <w:p>
-      <w:r>
-        <w:t xml:space="preserve">            &lt;b&gt;M&lt;/b&gt;</w:t>
-      </w:r>
-      <w:proofErr w:type="spellStart"/>
-      <w:r>
-        <w:t>ongoDB</w:t>
-      </w:r>
-      <w:proofErr w:type="spellEnd"/>
-      <w:r>
-        <w:t>: Base de datos NoSQL orientada a documentos JSON que permite almacenar datos de forma</w:t>
+        <w:t xml:space="preserve">    &lt;h3&gt;Tecnologías del Stack MERN&lt;/h3&gt;</w:t>
+      </w:r>
+    </w:p>
+    <w:p>
+      <w:r>
+        <w:t xml:space="preserve">    &lt;ul&gt;</w:t>
+      </w:r>
+    </w:p>
+    <w:p>
+      <w:r>
+        <w:t xml:space="preserve">        &lt;li&gt;</w:t>
+      </w:r>
+    </w:p>
+    <w:p>
+      <w:r>
+        <w:t xml:space="preserve">            &lt;b&gt;M&lt;/b&gt;ongoDB: Base de datos NoSQL orientada a documentos JSON que permite almacenar datos de forma</w:t>
       </w:r>
     </w:p>
     <w:p>
@@ -2119,49 +1448,17 @@
     </w:p>
     <w:p>
       <w:r>
-        <w:t xml:space="preserve">        &lt;/</w:t>
-      </w:r>
-      <w:proofErr w:type="spellStart"/>
-      <w:r>
-        <w:t>li</w:t>
-      </w:r>
-      <w:proofErr w:type="spellEnd"/>
-      <w:r>
-        <w:t>&gt;</w:t>
-      </w:r>
-    </w:p>
-    <w:p>
-      <w:r>
-        <w:t xml:space="preserve">        &lt;</w:t>
-      </w:r>
-      <w:proofErr w:type="spellStart"/>
-      <w:r>
-        <w:t>li</w:t>
-      </w:r>
-      <w:proofErr w:type="spellEnd"/>
-      <w:r>
-        <w:t>&gt;</w:t>
-      </w:r>
-    </w:p>
-    <w:p>
-      <w:r>
-        <w:t xml:space="preserve">            &lt;b&gt;E&lt;/b&gt;xpress.js: Framework minimalista para Node.js que facilita la creación de </w:t>
-      </w:r>
-      <w:proofErr w:type="spellStart"/>
-      <w:r>
-        <w:t>APIs</w:t>
-      </w:r>
-      <w:proofErr w:type="spellEnd"/>
-      <w:r>
-        <w:t xml:space="preserve"> </w:t>
-      </w:r>
-      <w:proofErr w:type="spellStart"/>
-      <w:r>
-        <w:t>RESTful</w:t>
-      </w:r>
-      <w:proofErr w:type="spellEnd"/>
-      <w:r>
-        <w:t xml:space="preserve"> y</w:t>
+        <w:t xml:space="preserve">        &lt;/li&gt;</w:t>
+      </w:r>
+    </w:p>
+    <w:p>
+      <w:r>
+        <w:t xml:space="preserve">        &lt;li&gt;</w:t>
+      </w:r>
+    </w:p>
+    <w:p>
+      <w:r>
+        <w:t xml:space="preserve">            &lt;b&gt;E&lt;/b&gt;xpress.js: Framework minimalista para Node.js que facilita la creación de APIs RESTful y</w:t>
       </w:r>
     </w:p>
     <w:p>
@@ -2171,42 +1468,18 @@
     </w:p>
     <w:p>
       <w:r>
-        <w:t xml:space="preserve">        &lt;/</w:t>
-      </w:r>
-      <w:proofErr w:type="spellStart"/>
-      <w:r>
-        <w:t>li</w:t>
-      </w:r>
-      <w:proofErr w:type="spellEnd"/>
-      <w:r>
-        <w:t>&gt;</w:t>
-      </w:r>
-    </w:p>
-    <w:p>
-      <w:r>
-        <w:t xml:space="preserve">        &lt;</w:t>
-      </w:r>
-      <w:proofErr w:type="spellStart"/>
-      <w:r>
-        <w:t>li</w:t>
-      </w:r>
-      <w:proofErr w:type="spellEnd"/>
-      <w:r>
-        <w:t>&gt;</w:t>
+        <w:t xml:space="preserve">        &lt;/li&gt;</w:t>
+      </w:r>
+    </w:p>
+    <w:p>
+      <w:r>
+        <w:t xml:space="preserve">        &lt;li&gt;</w:t>
       </w:r>
     </w:p>
     <w:p>
       <w:r>
         <w:lastRenderedPageBreak/>
-        <w:t xml:space="preserve">            &lt;b&gt;R&lt;/b&gt;</w:t>
-      </w:r>
-      <w:proofErr w:type="spellStart"/>
-      <w:r>
-        <w:t>eact</w:t>
-      </w:r>
-      <w:proofErr w:type="spellEnd"/>
-      <w:r>
-        <w:t>: Biblioteca de JavaScript para construir interfaces de usuario interactivas mediante</w:t>
+        <w:t xml:space="preserve">            &lt;b&gt;R&lt;/b&gt;eact: Biblioteca de JavaScript para construir interfaces de usuario interactivas mediante</w:t>
       </w:r>
     </w:p>
     <w:p>
@@ -2216,28 +1489,12 @@
     </w:p>
     <w:p>
       <w:r>
-        <w:t xml:space="preserve">        &lt;/</w:t>
-      </w:r>
-      <w:proofErr w:type="spellStart"/>
-      <w:r>
-        <w:t>li</w:t>
-      </w:r>
-      <w:proofErr w:type="spellEnd"/>
-      <w:r>
-        <w:t>&gt;</w:t>
-      </w:r>
-    </w:p>
-    <w:p>
-      <w:r>
-        <w:t xml:space="preserve">        &lt;</w:t>
-      </w:r>
-      <w:proofErr w:type="spellStart"/>
-      <w:r>
-        <w:t>li</w:t>
-      </w:r>
-      <w:proofErr w:type="spellEnd"/>
-      <w:r>
-        <w:t>&gt;</w:t>
+        <w:t xml:space="preserve">        &lt;/li&gt;</w:t>
+      </w:r>
+    </w:p>
+    <w:p>
+      <w:r>
+        <w:t xml:space="preserve">        &lt;li&gt;</w:t>
       </w:r>
     </w:p>
     <w:p>
@@ -2252,28 +1509,12 @@
     </w:p>
     <w:p>
       <w:r>
-        <w:t xml:space="preserve">        &lt;/</w:t>
-      </w:r>
-      <w:proofErr w:type="spellStart"/>
-      <w:r>
-        <w:t>li</w:t>
-      </w:r>
-      <w:proofErr w:type="spellEnd"/>
-      <w:r>
-        <w:t>&gt;</w:t>
-      </w:r>
-    </w:p>
-    <w:p>
-      <w:r>
-        <w:t xml:space="preserve">    &lt;/</w:t>
-      </w:r>
-      <w:proofErr w:type="spellStart"/>
-      <w:r>
-        <w:t>ul</w:t>
-      </w:r>
-      <w:proofErr w:type="spellEnd"/>
-      <w:r>
-        <w:t>&gt;</w:t>
+        <w:t xml:space="preserve">        &lt;/li&gt;</w:t>
+      </w:r>
+    </w:p>
+    <w:p>
+      <w:r>
+        <w:t xml:space="preserve">    &lt;/ul&gt;</w:t>
       </w:r>
     </w:p>
     <w:p/>
@@ -2390,15 +1631,7 @@
     <w:p/>
     <w:p>
       <w:r>
-        <w:t>Buenísimo que hayas diferenciado cuando usar etiquetas &lt;</w:t>
-      </w:r>
-      <w:proofErr w:type="spellStart"/>
-      <w:r>
-        <w:t>strong</w:t>
-      </w:r>
-      <w:proofErr w:type="spellEnd"/>
-      <w:r>
-        <w:t xml:space="preserve">&gt; y &lt;b&gt; </w:t>
+        <w:t xml:space="preserve">Buenísimo que hayas diferenciado cuando usar etiquetas &lt;strong&gt; y &lt;b&gt; </w:t>
       </w:r>
     </w:p>
     <w:p/>
@@ -2412,41 +1645,15 @@
     </w:p>
     <w:p/>
     <w:p>
-      <w:proofErr w:type="spellStart"/>
-      <w:r>
-        <w:t>Recorda</w:t>
-      </w:r>
-      <w:proofErr w:type="spellEnd"/>
-      <w:r>
-        <w:t xml:space="preserve"> cambiar el lenguaje a español &lt;</w:t>
-      </w:r>
-      <w:proofErr w:type="spellStart"/>
-      <w:r>
-        <w:t>html</w:t>
-      </w:r>
-      <w:proofErr w:type="spellEnd"/>
-      <w:r>
-        <w:t xml:space="preserve"> </w:t>
-      </w:r>
-      <w:proofErr w:type="spellStart"/>
-      <w:r>
-        <w:t>lang</w:t>
-      </w:r>
-      <w:proofErr w:type="spellEnd"/>
-      <w:r>
-        <w:t>="es"&gt; porque esto le dice a los motores de búsqueda en que idioma esta tu sitio web.</w:t>
-      </w:r>
-    </w:p>
-    <w:p/>
-    <w:p>
-      <w:r>
-        <w:t xml:space="preserve">Podes utilizar el atajo en el teclado para darle formato al documento y que quede más ordenado con las teclas: </w:t>
-      </w:r>
-      <w:proofErr w:type="spellStart"/>
-      <w:r>
-        <w:t>Alt+Shift+f</w:t>
-      </w:r>
-      <w:proofErr w:type="spellEnd"/>
+      <w:r>
+        <w:t>Recorda cambiar el lenguaje a español &lt;html lang="es"&gt; porque esto le dice a los motores de búsqueda en que idioma esta tu sitio web.</w:t>
+      </w:r>
+    </w:p>
+    <w:p/>
+    <w:p>
+      <w:r>
+        <w:t>Podes utilizar el atajo en el teclado para darle formato al documento y que quede más ordenado con las teclas: Alt+Shift+f</w:t>
+      </w:r>
     </w:p>
     <w:p/>
     <w:p>
@@ -2484,23 +1691,13 @@
           <w:bCs/>
         </w:rPr>
       </w:pPr>
-      <w:proofErr w:type="spellStart"/>
-      <w:r>
-        <w:rPr>
-          <w:rFonts w:ascii="Segoe UI Emoji" w:hAnsi="Segoe UI Emoji" w:cs="Segoe UI Emoji"/>
-          <w:b/>
-          <w:bCs/>
-        </w:rPr>
-        <w:t>Perezlindo</w:t>
-      </w:r>
-      <w:proofErr w:type="spellEnd"/>
-      <w:r>
-        <w:rPr>
-          <w:rFonts w:ascii="Segoe UI Emoji" w:hAnsi="Segoe UI Emoji" w:cs="Segoe UI Emoji"/>
-          <w:b/>
-          <w:bCs/>
-        </w:rPr>
-        <w:t xml:space="preserve"> Franco</w:t>
+      <w:r>
+        <w:rPr>
+          <w:rFonts w:ascii="Segoe UI Emoji" w:hAnsi="Segoe UI Emoji" w:cs="Segoe UI Emoji"/>
+          <w:b/>
+          <w:bCs/>
+        </w:rPr>
+        <w:t>Perezlindo Franco</w:t>
       </w:r>
     </w:p>
     <w:p>
@@ -2555,15 +1752,7 @@
     <w:p/>
     <w:p>
       <w:r>
-        <w:t>Buenísimo que hayas diferenciado cuando usar etiquetas &lt;</w:t>
-      </w:r>
-      <w:proofErr w:type="spellStart"/>
-      <w:r>
-        <w:t>strong</w:t>
-      </w:r>
-      <w:proofErr w:type="spellEnd"/>
-      <w:r>
-        <w:t xml:space="preserve">&gt; y &lt;b&gt; </w:t>
+        <w:t xml:space="preserve">Buenísimo que hayas diferenciado cuando usar etiquetas &lt;strong&gt; y &lt;b&gt; </w:t>
       </w:r>
     </w:p>
     <w:p/>
@@ -2575,30 +1764,9 @@
     </w:p>
     <w:p/>
     <w:p>
-      <w:proofErr w:type="spellStart"/>
       <w:r>
         <w:lastRenderedPageBreak/>
-        <w:t>Recorda</w:t>
-      </w:r>
-      <w:proofErr w:type="spellEnd"/>
-      <w:r>
-        <w:t xml:space="preserve"> cambiar el lenguaje a español &lt;</w:t>
-      </w:r>
-      <w:proofErr w:type="spellStart"/>
-      <w:r>
-        <w:t>html</w:t>
-      </w:r>
-      <w:proofErr w:type="spellEnd"/>
-      <w:r>
-        <w:t xml:space="preserve"> </w:t>
-      </w:r>
-      <w:proofErr w:type="spellStart"/>
-      <w:r>
-        <w:t>lang</w:t>
-      </w:r>
-      <w:proofErr w:type="spellEnd"/>
-      <w:r>
-        <w:t>="es"&gt; porque esto le dice a los motores de búsqueda en que idioma esta tu sitio web.</w:t>
+        <w:t>Recorda cambiar el lenguaje a español &lt;html lang="es"&gt; porque esto le dice a los motores de búsqueda en que idioma esta tu sitio web.</w:t>
       </w:r>
     </w:p>
     <w:p/>
@@ -2644,52 +1812,14 @@
           <w:bCs/>
         </w:rPr>
       </w:pPr>
-      <w:proofErr w:type="spellStart"/>
-      <w:r>
-        <w:rPr>
-          <w:rFonts w:ascii="Segoe UI Emoji" w:hAnsi="Segoe UI Emoji" w:cs="Segoe UI Emoji"/>
-          <w:b/>
-          <w:bCs/>
-        </w:rPr>
-        <w:t>Zuñiga</w:t>
-      </w:r>
-      <w:proofErr w:type="spellEnd"/>
-      <w:r>
-        <w:rPr>
-          <w:rFonts w:ascii="Segoe UI Emoji" w:hAnsi="Segoe UI Emoji" w:cs="Segoe UI Emoji"/>
-          <w:b/>
-          <w:bCs/>
-        </w:rPr>
-        <w:t xml:space="preserve"> </w:t>
-      </w:r>
-      <w:proofErr w:type="spellStart"/>
-      <w:r>
-        <w:rPr>
-          <w:rFonts w:ascii="Segoe UI Emoji" w:hAnsi="Segoe UI Emoji" w:cs="Segoe UI Emoji"/>
-          <w:b/>
-          <w:bCs/>
-        </w:rPr>
-        <w:t>Hernandez</w:t>
-      </w:r>
-      <w:proofErr w:type="spellEnd"/>
-      <w:r>
-        <w:rPr>
-          <w:rFonts w:ascii="Segoe UI Emoji" w:hAnsi="Segoe UI Emoji" w:cs="Segoe UI Emoji"/>
-          <w:b/>
-          <w:bCs/>
-        </w:rPr>
-        <w:t xml:space="preserve"> Carlos </w:t>
-      </w:r>
-      <w:proofErr w:type="spellStart"/>
-      <w:r>
-        <w:rPr>
-          <w:rFonts w:ascii="Segoe UI Emoji" w:hAnsi="Segoe UI Emoji" w:cs="Segoe UI Emoji"/>
-          <w:b/>
-          <w:bCs/>
-        </w:rPr>
-        <w:t>Andres</w:t>
-      </w:r>
-      <w:proofErr w:type="spellEnd"/>
+      <w:r>
+        <w:rPr>
+          <w:rFonts w:ascii="Segoe UI Emoji" w:hAnsi="Segoe UI Emoji" w:cs="Segoe UI Emoji"/>
+          <w:b/>
+          <w:bCs/>
+        </w:rPr>
+        <w:t>Zuñiga Hernandez Carlos Andres</w:t>
+      </w:r>
     </w:p>
     <w:p>
       <w:pPr>
@@ -2725,7 +1855,13 @@
     <w:p/>
     <w:p>
       <w:r>
-        <w:t>Hola Franco, quería felicitarte por el trabajo que realizaste. El resultado renderizado es el solicitado.</w:t>
+        <w:t xml:space="preserve">Hola </w:t>
+      </w:r>
+      <w:r>
+        <w:t>Carlos</w:t>
+      </w:r>
+      <w:r>
+        <w:t>, quería felicitarte por el trabajo que realizaste. El resultado renderizado es el solicitado.</w:t>
       </w:r>
     </w:p>
     <w:p/>
@@ -2743,15 +1879,7 @@
     <w:p/>
     <w:p>
       <w:r>
-        <w:t>Buenísimo que hayas diferenciado cuando usar etiquetas &lt;</w:t>
-      </w:r>
-      <w:proofErr w:type="spellStart"/>
-      <w:r>
-        <w:t>strong</w:t>
-      </w:r>
-      <w:proofErr w:type="spellEnd"/>
-      <w:r>
-        <w:t xml:space="preserve">&gt; y &lt;b&gt; </w:t>
+        <w:t xml:space="preserve">Buenísimo que hayas diferenciado cuando usar etiquetas &lt;strong&gt; y &lt;b&gt; </w:t>
       </w:r>
     </w:p>
     <w:p/>
@@ -2763,29 +1891,8 @@
     </w:p>
     <w:p/>
     <w:p>
-      <w:proofErr w:type="spellStart"/>
-      <w:r>
-        <w:t>Recorda</w:t>
-      </w:r>
-      <w:proofErr w:type="spellEnd"/>
-      <w:r>
-        <w:t xml:space="preserve"> cambiar el lenguaje a español &lt;</w:t>
-      </w:r>
-      <w:proofErr w:type="spellStart"/>
-      <w:r>
-        <w:t>html</w:t>
-      </w:r>
-      <w:proofErr w:type="spellEnd"/>
-      <w:r>
-        <w:t xml:space="preserve"> </w:t>
-      </w:r>
-      <w:proofErr w:type="spellStart"/>
-      <w:r>
-        <w:t>lang</w:t>
-      </w:r>
-      <w:proofErr w:type="spellEnd"/>
-      <w:r>
-        <w:t>="es"&gt; porque esto le dice a los motores de búsqueda en que idioma esta tu sitio web.</w:t>
+      <w:r>
+        <w:t>Recorda cambiar el lenguaje a español &lt;html lang="es"&gt; porque esto le dice a los motores de búsqueda en que idioma esta tu sitio web.</w:t>
       </w:r>
     </w:p>
     <w:p/>
@@ -2892,23 +1999,7 @@
     <w:p/>
     <w:p>
       <w:r>
-        <w:t>Buenísimo que aplicaste etiquetas &lt;b&gt; para resaltar en negrita textos, te falto aplicar palabras claves con etiquetas &lt;</w:t>
-      </w:r>
-      <w:proofErr w:type="spellStart"/>
-      <w:r>
-        <w:t>strong</w:t>
-      </w:r>
-      <w:proofErr w:type="spellEnd"/>
-      <w:r>
-        <w:t xml:space="preserve">&gt;, </w:t>
-      </w:r>
-      <w:proofErr w:type="spellStart"/>
-      <w:r>
-        <w:t>recorda</w:t>
-      </w:r>
-      <w:proofErr w:type="spellEnd"/>
-      <w:r>
-        <w:t xml:space="preserve"> que ayudan para que los motores de búsqueda entiendan mejor el contenido de tu documento web. </w:t>
+        <w:t xml:space="preserve">Buenísimo que aplicaste etiquetas &lt;b&gt; para resaltar en negrita textos, te falto aplicar palabras claves con etiquetas &lt;strong&gt;, recorda que ayudan para que los motores de búsqueda entiendan mejor el contenido de tu documento web. </w:t>
       </w:r>
     </w:p>
     <w:p/>
@@ -2954,25 +2045,7 @@
           <w:b/>
           <w:bCs/>
         </w:rPr>
-        <w:t xml:space="preserve">Cabrera </w:t>
-      </w:r>
-      <w:proofErr w:type="spellStart"/>
-      <w:r>
-        <w:rPr>
-          <w:rFonts w:ascii="Segoe UI Emoji" w:hAnsi="Segoe UI Emoji" w:cs="Segoe UI Emoji"/>
-          <w:b/>
-          <w:bCs/>
-        </w:rPr>
-        <w:t>Kowalsky</w:t>
-      </w:r>
-      <w:proofErr w:type="spellEnd"/>
-      <w:r>
-        <w:rPr>
-          <w:rFonts w:ascii="Segoe UI Emoji" w:hAnsi="Segoe UI Emoji" w:cs="Segoe UI Emoji"/>
-          <w:b/>
-          <w:bCs/>
-        </w:rPr>
-        <w:t xml:space="preserve"> Sofia Abril</w:t>
+        <w:t>Cabrera Kowalsky Sofia Abril</w:t>
       </w:r>
     </w:p>
     <w:p>
@@ -3046,15 +2119,7 @@
     <w:p/>
     <w:p>
       <w:r>
-        <w:t>Buenísimo que hayas diferenciado cuando usar etiquetas &lt;</w:t>
-      </w:r>
-      <w:proofErr w:type="spellStart"/>
-      <w:r>
-        <w:t>strong</w:t>
-      </w:r>
-      <w:proofErr w:type="spellEnd"/>
-      <w:r>
-        <w:t xml:space="preserve">&gt; y &lt;b&gt; </w:t>
+        <w:t xml:space="preserve">Buenísimo que hayas diferenciado cuando usar etiquetas &lt;strong&gt; y &lt;b&gt; </w:t>
       </w:r>
     </w:p>
     <w:p/>
@@ -3114,23 +2179,13 @@
           <w:bCs/>
         </w:rPr>
       </w:pPr>
-      <w:proofErr w:type="spellStart"/>
-      <w:r>
-        <w:rPr>
-          <w:rFonts w:ascii="Segoe UI Emoji" w:hAnsi="Segoe UI Emoji" w:cs="Segoe UI Emoji"/>
-          <w:b/>
-          <w:bCs/>
-        </w:rPr>
-        <w:t>Imas</w:t>
-      </w:r>
-      <w:proofErr w:type="spellEnd"/>
-      <w:r>
-        <w:rPr>
-          <w:rFonts w:ascii="Segoe UI Emoji" w:hAnsi="Segoe UI Emoji" w:cs="Segoe UI Emoji"/>
-          <w:b/>
-          <w:bCs/>
-        </w:rPr>
-        <w:t xml:space="preserve"> Guerrero Catalina Eva</w:t>
+      <w:r>
+        <w:rPr>
+          <w:rFonts w:ascii="Segoe UI Emoji" w:hAnsi="Segoe UI Emoji" w:cs="Segoe UI Emoji"/>
+          <w:b/>
+          <w:bCs/>
+        </w:rPr>
+        <w:t>Imas Guerrero Catalina Eva</w:t>
       </w:r>
     </w:p>
     <w:p>
@@ -3192,23 +2247,7 @@
         <w:ind w:left="360"/>
       </w:pPr>
       <w:r>
-        <w:t>Cambiar el lenguaje a español &lt;</w:t>
-      </w:r>
-      <w:proofErr w:type="spellStart"/>
-      <w:r>
-        <w:t>html</w:t>
-      </w:r>
-      <w:proofErr w:type="spellEnd"/>
-      <w:r>
-        <w:t xml:space="preserve"> </w:t>
-      </w:r>
-      <w:proofErr w:type="spellStart"/>
-      <w:r>
-        <w:t>lang</w:t>
-      </w:r>
-      <w:proofErr w:type="spellEnd"/>
-      <w:r>
-        <w:t>="es"&gt;, porque le dice a los motores de búsqueda en que idioma esta tu sitio web.</w:t>
+        <w:t>Cambiar el lenguaje a español &lt;html lang="es"&gt;, porque le dice a los motores de búsqueda en que idioma esta tu sitio web.</w:t>
       </w:r>
     </w:p>
     <w:p/>
@@ -3217,55 +2256,7 @@
         <w:ind w:left="360"/>
       </w:pPr>
       <w:r>
-        <w:t>Recaudo con el uso de la etiqueta &lt;</w:t>
-      </w:r>
-      <w:proofErr w:type="spellStart"/>
-      <w:r>
-        <w:t>strong</w:t>
-      </w:r>
-      <w:proofErr w:type="spellEnd"/>
-      <w:r>
-        <w:t xml:space="preserve">&gt;, </w:t>
-      </w:r>
-      <w:proofErr w:type="spellStart"/>
-      <w:r>
-        <w:t>recorda</w:t>
-      </w:r>
-      <w:proofErr w:type="spellEnd"/>
-      <w:r>
-        <w:t xml:space="preserve"> que le dice a los motores de búsqueda que esa </w:t>
-      </w:r>
-      <w:proofErr w:type="spellStart"/>
-      <w:r>
-        <w:t>info</w:t>
-      </w:r>
-      <w:proofErr w:type="spellEnd"/>
-      <w:r>
-        <w:t xml:space="preserve"> es importante y que la tome en cuenta cuando imprime los resultados de búsqueda, por lo cual es recomendable utilizarla con recaudo. Por ejemplo en la parte del significado del término MERN que la primer letra del </w:t>
-      </w:r>
-      <w:proofErr w:type="spellStart"/>
-      <w:r>
-        <w:t>item</w:t>
-      </w:r>
-      <w:proofErr w:type="spellEnd"/>
-      <w:r>
-        <w:t xml:space="preserve"> va en negrita podes utilizar en lugar de &lt;</w:t>
-      </w:r>
-      <w:proofErr w:type="spellStart"/>
-      <w:r>
-        <w:t>strong</w:t>
-      </w:r>
-      <w:proofErr w:type="spellEnd"/>
-      <w:r>
-        <w:t xml:space="preserve">&gt; la etiqueta &lt;b&gt; que pone en negrita la letra pero con un fin </w:t>
-      </w:r>
-      <w:proofErr w:type="spellStart"/>
-      <w:r>
-        <w:t>mas</w:t>
-      </w:r>
-      <w:proofErr w:type="spellEnd"/>
-      <w:r>
-        <w:t xml:space="preserve"> que todo de estética visual para el usuario:</w:t>
+        <w:t>Recaudo con el uso de la etiqueta &lt;strong&gt;, recorda que le dice a los motores de búsqueda que esa info es importante y que la tome en cuenta cuando imprime los resultados de búsqueda, por lo cual es recomendable utilizarla con recaudo. Por ejemplo en la parte del significado del término MERN que la primer letra del item va en negrita podes utilizar en lugar de &lt;strong&gt; la etiqueta &lt;b&gt; que pone en negrita la letra pero con un fin mas que todo de estética visual para el usuario:</w:t>
       </w:r>
     </w:p>
     <w:p>
@@ -3277,73 +2268,74 @@
       <w:pPr>
         <w:pStyle w:val="Prrafodelista"/>
         <w:ind w:left="2124"/>
-      </w:pPr>
-      <w:r>
-        <w:t>&lt;</w:t>
-      </w:r>
-      <w:proofErr w:type="spellStart"/>
-      <w:r>
-        <w:t>ul</w:t>
-      </w:r>
-      <w:proofErr w:type="spellEnd"/>
-      <w:r>
-        <w:t>&gt;</w:t>
+        <w:rPr>
+          <w:lang w:val="en-US"/>
+        </w:rPr>
+      </w:pPr>
+      <w:r>
+        <w:rPr>
+          <w:lang w:val="en-US"/>
+        </w:rPr>
+        <w:t>&lt;ul&gt;</w:t>
       </w:r>
     </w:p>
     <w:p>
       <w:pPr>
         <w:pStyle w:val="Prrafodelista"/>
         <w:ind w:left="2124"/>
-      </w:pPr>
-      <w:r>
-        <w:t>    &lt;</w:t>
-      </w:r>
-      <w:proofErr w:type="spellStart"/>
-      <w:r>
-        <w:t>li</w:t>
-      </w:r>
-      <w:proofErr w:type="spellEnd"/>
-      <w:r>
-        <w:t>&gt;&lt;b&gt;</w:t>
-      </w:r>
-      <w:r>
+        <w:rPr>
+          <w:lang w:val="en-US"/>
+        </w:rPr>
+      </w:pPr>
+      <w:r>
+        <w:rPr>
+          <w:lang w:val="en-US"/>
+        </w:rPr>
+        <w:t>    &lt;li&gt;&lt;b&gt;</w:t>
+      </w:r>
+      <w:r>
+        <w:rPr>
+          <w:lang w:val="en-US"/>
+        </w:rPr>
         <w:t>M</w:t>
       </w:r>
       <w:r>
-        <w:t>&lt;/b&gt;</w:t>
-      </w:r>
-      <w:proofErr w:type="spellStart"/>
-      <w:r>
-        <w:t>o</w:t>
-      </w:r>
-      <w:r>
-        <w:t>ngoDB</w:t>
-      </w:r>
-      <w:proofErr w:type="spellEnd"/>
-      <w:r>
-        <w:t>….</w:t>
-      </w:r>
-      <w:r>
-        <w:t>&lt;/</w:t>
-      </w:r>
-      <w:proofErr w:type="spellStart"/>
-      <w:r>
-        <w:t>li</w:t>
-      </w:r>
-      <w:proofErr w:type="spellEnd"/>
-      <w:r>
-        <w:t>&gt;</w:t>
+        <w:rPr>
+          <w:lang w:val="en-US"/>
+        </w:rPr>
+        <w:t>&lt;/b&gt;o</w:t>
+      </w:r>
+      <w:r>
+        <w:rPr>
+          <w:lang w:val="en-US"/>
+        </w:rPr>
+        <w:t>ngoDB….</w:t>
+      </w:r>
+      <w:r>
+        <w:rPr>
+          <w:lang w:val="en-US"/>
+        </w:rPr>
+        <w:t>&lt;/li&gt;</w:t>
       </w:r>
     </w:p>
     <w:p>
       <w:pPr>
         <w:pStyle w:val="Prrafodelista"/>
         <w:ind w:left="2124"/>
-      </w:pPr>
-      <w:r>
+        <w:rPr>
+          <w:lang w:val="en-US"/>
+        </w:rPr>
+      </w:pPr>
+      <w:r>
+        <w:rPr>
+          <w:lang w:val="en-US"/>
+        </w:rPr>
         <w:t xml:space="preserve">    </w:t>
       </w:r>
       <w:r>
+        <w:rPr>
+          <w:lang w:val="en-US"/>
+        </w:rPr>
         <w:t xml:space="preserve">….. </w:t>
       </w:r>
     </w:p>
@@ -3351,8 +2343,14 @@
       <w:pPr>
         <w:pStyle w:val="Prrafodelista"/>
         <w:ind w:left="2124"/>
-      </w:pPr>
-      <w:r>
+        <w:rPr>
+          <w:lang w:val="en-US"/>
+        </w:rPr>
+      </w:pPr>
+      <w:r>
+        <w:rPr>
+          <w:lang w:val="en-US"/>
+        </w:rPr>
         <w:t xml:space="preserve">    ….</w:t>
       </w:r>
     </w:p>
@@ -3360,37 +2358,39 @@
       <w:pPr>
         <w:pStyle w:val="Prrafodelista"/>
         <w:ind w:left="2124"/>
-      </w:pPr>
-      <w:r>
-        <w:t>    &lt;</w:t>
-      </w:r>
-      <w:proofErr w:type="spellStart"/>
-      <w:r>
-        <w:t>li</w:t>
-      </w:r>
-      <w:proofErr w:type="spellEnd"/>
-      <w:r>
-        <w:t>&gt;&lt;b&gt;</w:t>
-      </w:r>
-      <w:r>
+        <w:rPr>
+          <w:lang w:val="en-US"/>
+        </w:rPr>
+      </w:pPr>
+      <w:r>
+        <w:rPr>
+          <w:lang w:val="en-US"/>
+        </w:rPr>
+        <w:t>    &lt;li&gt;&lt;b&gt;</w:t>
+      </w:r>
+      <w:r>
+        <w:rPr>
+          <w:lang w:val="en-US"/>
+        </w:rPr>
         <w:t>N</w:t>
       </w:r>
       <w:r>
+        <w:rPr>
+          <w:lang w:val="en-US"/>
+        </w:rPr>
         <w:t>&lt;/b</w:t>
       </w:r>
       <w:r>
+        <w:rPr>
+          <w:lang w:val="en-US"/>
+        </w:rPr>
         <w:t>ode.js….</w:t>
       </w:r>
       <w:r>
-        <w:t>&lt;/</w:t>
-      </w:r>
-      <w:proofErr w:type="spellStart"/>
-      <w:r>
-        <w:t>li</w:t>
-      </w:r>
-      <w:proofErr w:type="spellEnd"/>
-      <w:r>
-        <w:t>&gt;  </w:t>
+        <w:rPr>
+          <w:lang w:val="en-US"/>
+        </w:rPr>
+        <w:t>&lt;/li&gt;  </w:t>
       </w:r>
     </w:p>
     <w:p>
@@ -3399,15 +2399,7 @@
         <w:ind w:left="2124"/>
       </w:pPr>
       <w:r>
-        <w:t>&lt;/</w:t>
-      </w:r>
-      <w:proofErr w:type="spellStart"/>
-      <w:r>
-        <w:t>ul</w:t>
-      </w:r>
-      <w:proofErr w:type="spellEnd"/>
-      <w:r>
-        <w:t>&gt;</w:t>
+        <w:t>&lt;/ul&gt;</w:t>
       </w:r>
     </w:p>
     <w:p>
@@ -3520,15 +2512,7 @@
     <w:p/>
     <w:p>
       <w:r>
-        <w:t>Buenísimo que hayas diferenciado cuando usar etiquetas &lt;</w:t>
-      </w:r>
-      <w:proofErr w:type="spellStart"/>
-      <w:r>
-        <w:t>strong</w:t>
-      </w:r>
-      <w:proofErr w:type="spellEnd"/>
-      <w:r>
-        <w:t xml:space="preserve">&gt; y &lt;b&gt; </w:t>
+        <w:t xml:space="preserve">Buenísimo que hayas diferenciado cuando usar etiquetas &lt;strong&gt; y &lt;b&gt; </w:t>
       </w:r>
     </w:p>
     <w:p/>
@@ -3640,15 +2624,7 @@
     <w:p/>
     <w:p>
       <w:r>
-        <w:t>Buenísimo que hayas diferenciado cuando usar etiquetas &lt;</w:t>
-      </w:r>
-      <w:proofErr w:type="spellStart"/>
-      <w:r>
-        <w:t>strong</w:t>
-      </w:r>
-      <w:proofErr w:type="spellEnd"/>
-      <w:r>
-        <w:t xml:space="preserve">&gt; y &lt;b&gt; </w:t>
+        <w:t xml:space="preserve">Buenísimo que hayas diferenciado cuando usar etiquetas &lt;strong&gt; y &lt;b&gt; </w:t>
       </w:r>
     </w:p>
     <w:p/>
@@ -3700,18 +2676,8 @@
           <w:b/>
           <w:bCs/>
         </w:rPr>
-        <w:t xml:space="preserve">Core </w:t>
-      </w:r>
-      <w:proofErr w:type="spellStart"/>
-      <w:r>
-        <w:rPr>
-          <w:rFonts w:ascii="Segoe UI Emoji" w:hAnsi="Segoe UI Emoji" w:cs="Segoe UI Emoji"/>
-          <w:b/>
-          <w:bCs/>
-        </w:rPr>
-        <w:t>Maximo</w:t>
-      </w:r>
-      <w:proofErr w:type="spellEnd"/>
+        <w:t>Core Maximo</w:t>
+      </w:r>
     </w:p>
     <w:p>
       <w:pPr>
@@ -3772,29 +2738,8 @@
           <w:numId w:val="1"/>
         </w:numPr>
       </w:pPr>
-      <w:proofErr w:type="spellStart"/>
-      <w:r>
-        <w:t>Recordá</w:t>
-      </w:r>
-      <w:proofErr w:type="spellEnd"/>
-      <w:r>
-        <w:t xml:space="preserve"> cambiar el lenguaje a español &lt;</w:t>
-      </w:r>
-      <w:proofErr w:type="spellStart"/>
-      <w:r>
-        <w:t>html</w:t>
-      </w:r>
-      <w:proofErr w:type="spellEnd"/>
-      <w:r>
-        <w:t xml:space="preserve"> </w:t>
-      </w:r>
-      <w:proofErr w:type="spellStart"/>
-      <w:r>
-        <w:t>lang</w:t>
-      </w:r>
-      <w:proofErr w:type="spellEnd"/>
-      <w:r>
-        <w:t>="es"&gt; porque esto le dice a los motores de búsqueda en que idioma esta tu sitio web.</w:t>
+      <w:r>
+        <w:t>Recordá cambiar el lenguaje a español &lt;html lang="es"&gt; porque esto le dice a los motores de búsqueda en que idioma esta tu sitio web.</w:t>
       </w:r>
     </w:p>
     <w:p>
@@ -3816,23 +2761,7 @@
         </w:numPr>
       </w:pPr>
       <w:r>
-        <w:t xml:space="preserve">En la parte del significado del término FODA que la primer letra del </w:t>
-      </w:r>
-      <w:proofErr w:type="spellStart"/>
-      <w:r>
-        <w:t>item</w:t>
-      </w:r>
-      <w:proofErr w:type="spellEnd"/>
-      <w:r>
-        <w:t xml:space="preserve"> va en negrita </w:t>
-      </w:r>
-      <w:proofErr w:type="spellStart"/>
-      <w:r>
-        <w:t>podias</w:t>
-      </w:r>
-      <w:proofErr w:type="spellEnd"/>
-      <w:r>
-        <w:t xml:space="preserve"> utilizar la etiqueta &lt;b&gt; que pone en negrita la letra pero con un fin más que todo de estética visual para el usuario, te quedaría así:</w:t>
+        <w:t>En la parte del significado del término FODA que la primer letra del item va en negrita podias utilizar la etiqueta &lt;b&gt; que pone en negrita la letra pero con un fin más que todo de estética visual para el usuario, te quedaría así:</w:t>
       </w:r>
     </w:p>
     <w:p>
@@ -3846,15 +2775,7 @@
         <w:ind w:left="2124"/>
       </w:pPr>
       <w:r>
-        <w:t>&lt;</w:t>
-      </w:r>
-      <w:proofErr w:type="spellStart"/>
-      <w:r>
-        <w:t>ul</w:t>
-      </w:r>
-      <w:proofErr w:type="spellEnd"/>
-      <w:r>
-        <w:t>&gt;</w:t>
+        <w:t>&lt;ul&gt;</w:t>
       </w:r>
     </w:p>
     <w:p>
@@ -3863,31 +2784,7 @@
         <w:ind w:left="2124"/>
       </w:pPr>
       <w:r>
-        <w:t>    &lt;</w:t>
-      </w:r>
-      <w:proofErr w:type="spellStart"/>
-      <w:r>
-        <w:t>li</w:t>
-      </w:r>
-      <w:proofErr w:type="spellEnd"/>
-      <w:r>
-        <w:t>&gt;&lt;b&gt;F&lt;/b&gt;</w:t>
-      </w:r>
-      <w:proofErr w:type="spellStart"/>
-      <w:r>
-        <w:t>ortalezas</w:t>
-      </w:r>
-      <w:proofErr w:type="spellEnd"/>
-      <w:r>
-        <w:t>&lt;/</w:t>
-      </w:r>
-      <w:proofErr w:type="spellStart"/>
-      <w:r>
-        <w:t>li</w:t>
-      </w:r>
-      <w:proofErr w:type="spellEnd"/>
-      <w:r>
-        <w:t>&gt;</w:t>
+        <w:t>    &lt;li&gt;&lt;b&gt;F&lt;/b&gt;ortalezas&lt;/li&gt;</w:t>
       </w:r>
     </w:p>
     <w:p>
@@ -3896,31 +2793,7 @@
         <w:ind w:left="2124"/>
       </w:pPr>
       <w:r>
-        <w:t>    &lt;</w:t>
-      </w:r>
-      <w:proofErr w:type="spellStart"/>
-      <w:r>
-        <w:t>li</w:t>
-      </w:r>
-      <w:proofErr w:type="spellEnd"/>
-      <w:r>
-        <w:t>&gt;&lt;b&gt;O&lt;/b&gt;</w:t>
-      </w:r>
-      <w:proofErr w:type="spellStart"/>
-      <w:r>
-        <w:t>bjetivos</w:t>
-      </w:r>
-      <w:proofErr w:type="spellEnd"/>
-      <w:r>
-        <w:t>&lt;/</w:t>
-      </w:r>
-      <w:proofErr w:type="spellStart"/>
-      <w:r>
-        <w:t>li</w:t>
-      </w:r>
-      <w:proofErr w:type="spellEnd"/>
-      <w:r>
-        <w:t>&gt;</w:t>
+        <w:t>    &lt;li&gt;&lt;b&gt;O&lt;/b&gt;bjetivos&lt;/li&gt;</w:t>
       </w:r>
     </w:p>
     <w:p>
@@ -3929,31 +2802,7 @@
         <w:ind w:left="2124"/>
       </w:pPr>
       <w:r>
-        <w:t>    &lt;</w:t>
-      </w:r>
-      <w:proofErr w:type="spellStart"/>
-      <w:r>
-        <w:t>li</w:t>
-      </w:r>
-      <w:proofErr w:type="spellEnd"/>
-      <w:r>
-        <w:t>&gt;&lt;b&gt;D&lt;/b&gt;</w:t>
-      </w:r>
-      <w:proofErr w:type="spellStart"/>
-      <w:r>
-        <w:t>ebilidades</w:t>
-      </w:r>
-      <w:proofErr w:type="spellEnd"/>
-      <w:r>
-        <w:t>&lt;/</w:t>
-      </w:r>
-      <w:proofErr w:type="spellStart"/>
-      <w:r>
-        <w:t>li</w:t>
-      </w:r>
-      <w:proofErr w:type="spellEnd"/>
-      <w:r>
-        <w:t>&gt;</w:t>
+        <w:t>    &lt;li&gt;&lt;b&gt;D&lt;/b&gt;ebilidades&lt;/li&gt;</w:t>
       </w:r>
     </w:p>
     <w:p>
@@ -3962,23 +2811,7 @@
         <w:ind w:left="2124"/>
       </w:pPr>
       <w:r>
-        <w:t>    &lt;</w:t>
-      </w:r>
-      <w:proofErr w:type="spellStart"/>
-      <w:r>
-        <w:t>li</w:t>
-      </w:r>
-      <w:proofErr w:type="spellEnd"/>
-      <w:r>
-        <w:t>&gt;&lt;b&gt;A&lt;/b&gt;menazas&lt;/</w:t>
-      </w:r>
-      <w:proofErr w:type="spellStart"/>
-      <w:r>
-        <w:t>li</w:t>
-      </w:r>
-      <w:proofErr w:type="spellEnd"/>
-      <w:r>
-        <w:t>&gt;  </w:t>
+        <w:t>    &lt;li&gt;&lt;b&gt;A&lt;/b&gt;menazas&lt;/li&gt;  </w:t>
       </w:r>
     </w:p>
     <w:p>
@@ -3987,15 +2820,7 @@
         <w:ind w:left="2124"/>
       </w:pPr>
       <w:r>
-        <w:t>&lt;/</w:t>
-      </w:r>
-      <w:proofErr w:type="spellStart"/>
-      <w:r>
-        <w:t>ul</w:t>
-      </w:r>
-      <w:proofErr w:type="spellEnd"/>
-      <w:r>
-        <w:t>&gt;</w:t>
+        <w:t>&lt;/ul&gt;</w:t>
       </w:r>
     </w:p>
     <w:p>
@@ -4025,31 +2850,7 @@
         </w:numPr>
       </w:pPr>
       <w:r>
-        <w:t xml:space="preserve">Falto usar la etiqueta </w:t>
-      </w:r>
-      <w:proofErr w:type="spellStart"/>
-      <w:r>
-        <w:t>strong</w:t>
-      </w:r>
-      <w:proofErr w:type="spellEnd"/>
-      <w:r>
-        <w:t xml:space="preserve"> en algún texto para darle énfasis de manera que los motores de búsqueda lo tomen en cuenta, por ejemplo podías enfatizar el </w:t>
-      </w:r>
-      <w:proofErr w:type="spellStart"/>
-      <w:r>
-        <w:t>termino</w:t>
-      </w:r>
-      <w:proofErr w:type="spellEnd"/>
-      <w:r>
-        <w:t xml:space="preserve"> “</w:t>
-      </w:r>
-      <w:proofErr w:type="spellStart"/>
-      <w:r>
-        <w:t>Analisis</w:t>
-      </w:r>
-      <w:proofErr w:type="spellEnd"/>
-      <w:r>
-        <w:t xml:space="preserve"> FODA” o el texto: “Resulta fundamental para una correcta toma de decisiones”</w:t>
+        <w:t>Falto usar la etiqueta strong en algún texto para darle énfasis de manera que los motores de búsqueda lo tomen en cuenta, por ejemplo podías enfatizar el termino “Analisis FODA” o el texto: “Resulta fundamental para una correcta toma de decisiones”</w:t>
       </w:r>
     </w:p>
     <w:p>
@@ -4094,7 +2895,7 @@
 </file>
 
 <file path=word/numbering.xml><?xml version="1.0" encoding="utf-8"?>
-<w:numbering xmlns:wpc="http://schemas.microsoft.com/office/word/2010/wordprocessingCanvas" xmlns:cx="http://schemas.microsoft.com/office/drawing/2014/chartex" xmlns:cx1="http://schemas.microsoft.com/office/drawing/2015/9/8/chartex" xmlns:cx2="http://schemas.microsoft.com/office/drawing/2015/10/21/chartex" xmlns:cx3="http://schemas.microsoft.com/office/drawing/2016/5/9/chartex" xmlns:cx4="http://schemas.microsoft.com/office/drawing/2016/5/10/chartex" xmlns:cx5="http://schemas.microsoft.com/office/drawing/2016/5/11/chartex" xmlns:cx6="http://schemas.microsoft.com/office/drawing/2016/5/12/chartex" xmlns:cx7="http://schemas.microsoft.com/office/drawing/2016/5/13/chartex" xmlns:cx8="http://schemas.microsoft.com/office/drawing/2016/5/14/chartex" xmlns:mc="http://schemas.openxmlformats.org/markup-compatibility/2006" xmlns:aink="http://schemas.microsoft.com/office/drawing/2016/ink" xmlns:am3d="http://schemas.microsoft.com/office/drawing/2017/model3d" xmlns:o="urn:schemas-microsoft-com:office:office" xmlns:r="http://schemas.openxmlformats.org/officeDocument/2006/relationships" xmlns:m="http://schemas.openxmlformats.org/officeDocument/2006/math" xmlns:v="urn:schemas-microsoft-com:vml" xmlns:wp14="http://schemas.microsoft.com/office/word/2010/wordprocessingDrawing" xmlns:wp="http://schemas.openxmlformats.org/drawingml/2006/wordprocessingDrawing" xmlns:w10="urn:schemas-microsoft-com:office:word" xmlns:w="http://schemas.openxmlformats.org/wordprocessingml/2006/main" xmlns:w14="http://schemas.microsoft.com/office/word/2010/wordml" xmlns:w15="http://schemas.microsoft.com/office/word/2012/wordml" xmlns:w16cex="http://schemas.microsoft.com/office/word/2018/wordml/cex" xmlns:w16cid="http://schemas.microsoft.com/office/word/2016/wordml/cid" xmlns:w16="http://schemas.microsoft.com/office/word/2018/wordml" xmlns:w16sdtdh="http://schemas.microsoft.com/office/word/2020/wordml/sdtdatahash" xmlns:w16se="http://schemas.microsoft.com/office/word/2015/wordml/symex" xmlns:wpg="http://schemas.microsoft.com/office/word/2010/wordprocessingGroup" xmlns:wpi="http://schemas.microsoft.com/office/word/2010/wordprocessingInk" xmlns:wne="http://schemas.microsoft.com/office/word/2006/wordml" xmlns:wps="http://schemas.microsoft.com/office/word/2010/wordprocessingShape" mc:Ignorable="w14 w15 w16se w16cid w16 w16cex w16sdtdh wp14">
+<w:numbering xmlns:wpc="http://schemas.microsoft.com/office/word/2010/wordprocessingCanvas" xmlns:cx="http://schemas.microsoft.com/office/drawing/2014/chartex" xmlns:cx1="http://schemas.microsoft.com/office/drawing/2015/9/8/chartex" xmlns:cx2="http://schemas.microsoft.com/office/drawing/2015/10/21/chartex" xmlns:cx3="http://schemas.microsoft.com/office/drawing/2016/5/9/chartex" xmlns:cx4="http://schemas.microsoft.com/office/drawing/2016/5/10/chartex" xmlns:cx5="http://schemas.microsoft.com/office/drawing/2016/5/11/chartex" xmlns:cx6="http://schemas.microsoft.com/office/drawing/2016/5/12/chartex" xmlns:cx7="http://schemas.microsoft.com/office/drawing/2016/5/13/chartex" xmlns:cx8="http://schemas.microsoft.com/office/drawing/2016/5/14/chartex" xmlns:mc="http://schemas.openxmlformats.org/markup-compatibility/2006" xmlns:aink="http://schemas.microsoft.com/office/drawing/2016/ink" xmlns:am3d="http://schemas.microsoft.com/office/drawing/2017/model3d" xmlns:o="urn:schemas-microsoft-com:office:office" xmlns:oel="http://schemas.microsoft.com/office/2019/extlst" xmlns:r="http://schemas.openxmlformats.org/officeDocument/2006/relationships" xmlns:m="http://schemas.openxmlformats.org/officeDocument/2006/math" xmlns:v="urn:schemas-microsoft-com:vml" xmlns:wp14="http://schemas.microsoft.com/office/word/2010/wordprocessingDrawing" xmlns:wp="http://schemas.openxmlformats.org/drawingml/2006/wordprocessingDrawing" xmlns:w10="urn:schemas-microsoft-com:office:word" xmlns:w="http://schemas.openxmlformats.org/wordprocessingml/2006/main" xmlns:w14="http://schemas.microsoft.com/office/word/2010/wordml" xmlns:w15="http://schemas.microsoft.com/office/word/2012/wordml" xmlns:w16cex="http://schemas.microsoft.com/office/word/2018/wordml/cex" xmlns:w16cid="http://schemas.microsoft.com/office/word/2016/wordml/cid" xmlns:w16="http://schemas.microsoft.com/office/word/2018/wordml" xmlns:w16du="http://schemas.microsoft.com/office/word/2023/wordml/word16du" xmlns:w16sdtdh="http://schemas.microsoft.com/office/word/2020/wordml/sdtdatahash" xmlns:w16sdtfl="http://schemas.microsoft.com/office/word/2024/wordml/sdtformatlock" xmlns:w16se="http://schemas.microsoft.com/office/word/2015/wordml/symex" xmlns:wpg="http://schemas.microsoft.com/office/word/2010/wordprocessingGroup" xmlns:wpi="http://schemas.microsoft.com/office/word/2010/wordprocessingInk" xmlns:wne="http://schemas.microsoft.com/office/word/2006/wordml" xmlns:wps="http://schemas.microsoft.com/office/word/2010/wordprocessingShape" mc:Ignorable="w14 w15 w16se w16cid w16 w16cex w16sdtdh w16sdtfl w16du wp14">
   <w:abstractNum w:abstractNumId="0" w15:restartNumberingAfterBreak="0">
     <w:nsid w:val="339D424A"/>
     <w:multiLevelType w:val="hybridMultilevel"/>
@@ -4321,17 +3122,17 @@
       </w:rPr>
     </w:lvl>
   </w:abstractNum>
-  <w:num w:numId="1">
+  <w:num w:numId="1" w16cid:durableId="1249343657">
     <w:abstractNumId w:val="0"/>
   </w:num>
-  <w:num w:numId="2">
+  <w:num w:numId="2" w16cid:durableId="1975597829">
     <w:abstractNumId w:val="1"/>
   </w:num>
 </w:numbering>
 </file>
 
 <file path=word/styles.xml><?xml version="1.0" encoding="utf-8"?>
-<w:styles xmlns:mc="http://schemas.openxmlformats.org/markup-compatibility/2006" xmlns:r="http://schemas.openxmlformats.org/officeDocument/2006/relationships" xmlns:w="http://schemas.openxmlformats.org/wordprocessingml/2006/main" xmlns:w14="http://schemas.microsoft.com/office/word/2010/wordml" xmlns:w15="http://schemas.microsoft.com/office/word/2012/wordml" xmlns:w16cex="http://schemas.microsoft.com/office/word/2018/wordml/cex" xmlns:w16cid="http://schemas.microsoft.com/office/word/2016/wordml/cid" xmlns:w16="http://schemas.microsoft.com/office/word/2018/wordml" xmlns:w16sdtdh="http://schemas.microsoft.com/office/word/2020/wordml/sdtdatahash" xmlns:w16se="http://schemas.microsoft.com/office/word/2015/wordml/symex" mc:Ignorable="w14 w15 w16se w16cid w16 w16cex w16sdtdh">
+<w:styles xmlns:mc="http://schemas.openxmlformats.org/markup-compatibility/2006" xmlns:r="http://schemas.openxmlformats.org/officeDocument/2006/relationships" xmlns:w="http://schemas.openxmlformats.org/wordprocessingml/2006/main" xmlns:w14="http://schemas.microsoft.com/office/word/2010/wordml" xmlns:w15="http://schemas.microsoft.com/office/word/2012/wordml" xmlns:w16cex="http://schemas.microsoft.com/office/word/2018/wordml/cex" xmlns:w16cid="http://schemas.microsoft.com/office/word/2016/wordml/cid" xmlns:w16="http://schemas.microsoft.com/office/word/2018/wordml" xmlns:w16du="http://schemas.microsoft.com/office/word/2023/wordml/word16du" xmlns:w16sdtdh="http://schemas.microsoft.com/office/word/2020/wordml/sdtdatahash" xmlns:w16sdtfl="http://schemas.microsoft.com/office/word/2024/wordml/sdtformatlock" xmlns:w16se="http://schemas.microsoft.com/office/word/2015/wordml/symex" mc:Ignorable="w14 w15 w16se w16cid w16 w16cex w16sdtdh w16sdtfl w16du">
   <w:docDefaults>
     <w:rPrDefault>
       <w:rPr>

</xml_diff>